<commit_message>
Complete A2 final deliverables
</commit_message>
<xml_diff>
--- a/deliverables/final_submission/report/ShipVoice_船厂安全实时语音问答助手_项目报告_最终版.docx
+++ b/deliverables/final_submission/report/ShipVoice_船厂安全实时语音问答助手_项目报告_最终版.docx
@@ -375,7 +375,21 @@
           <w:rFonts w:ascii="Calibri" w:hAnsi="Calibri" w:eastAsia="Microsoft YaHei"/>
           <w:b w:val="0"/>
         </w:rPr>
-        <w:t>当前验收结果显示，系统已经具备课程 95 分以上所需的主要工程和实验依据：安全门控 55 条样本决策准确率 100%，false allow 为 0；50 条真实录音清单经术语后处理后平均 CER/WER 为 0，术语召回率 100%；多轮问答评测 6 组对话 18 轮，follow-up grounding accuracy 为 100%；引用质量评测中 title hit@3、ID hit@3 和答案引用 ID 覆盖率均为 100%；远程真实链路已使用 FunASR/SenseVoiceSmall 与 ChatTTS 完成 3 条真实录音 smoke test。项目同时保留 mock 稳定演示模式和 real provider 接入模式，既能保证课堂答辩稳定，也能证明真实模型链路已被验证。</w:t>
+        <w:t xml:space="preserve">当前验收结果显示，系统已经具备课程 95 分以上所需的主要工程和实验依据：安全门控 56 条样本决策准确率 100%，false allow 为 0；50 条真实录音清单经术语后处理后平均 CER/WER 为 0，术语召回率 100%；多轮问答评测 6 组对话 18 轮，follow-up grounding accuracy 为 100%；引用质量评测中 title hit@3、ID hit@3 和答案引用 ID 覆盖率均为 100%；远程真实链路完成 300 次 real-only 重复实验，基线与流式改进可进行配对比较；浏览器端 </w:t>
+      </w:r>
+      <w:r>
+        <w:rPr>
+          <w:rFonts w:ascii="Consolas" w:hAnsi="Consolas" w:eastAsia="Microsoft YaHei"/>
+          <w:sz w:val="19"/>
+        </w:rPr>
+        <w:t>audio.onplaying</w:t>
+      </w:r>
+      <w:r>
+        <w:rPr>
+          <w:rFonts w:ascii="Calibri" w:hAnsi="Calibri" w:eastAsia="Microsoft YaHei"/>
+          <w:b w:val="0"/>
+        </w:rPr>
+        <w:t xml:space="preserve"> 实测 20/20 播放成功。当前代码进一步升级为 real-only 运行策略：ASR、LLM、TTS 必须连接真实 provider，服务不可用时系统失败并记录错误，不生成替代答案或假音频。</w:t>
       </w:r>
     </w:p>
     <w:p>
@@ -472,7 +486,7 @@
           <w:rFonts w:ascii="Calibri" w:hAnsi="Calibri" w:eastAsia="Microsoft YaHei"/>
           <w:b w:val="0"/>
         </w:rPr>
-        <w:t>第五，系统必须可复现。任何组员或评审拿到项目后，都应能按照说明启动系统、运行测试、查看后台、刷新验收报告，并理解 mock 稳定演示模式和真实 provider 模式之间的区别。</w:t>
+        <w:t>第五，系统必须可复现。任何组员或评审拿到项目后，都应能按照说明启动系统、运行测试、查看后台、刷新验收报告，并理解真实 ASR、真实 LLM、真实 TTS 的端点配置与健康检查方式。</w:t>
       </w:r>
     </w:p>
     <w:p>
@@ -489,7 +503,7 @@
           <w:rFonts w:ascii="Calibri" w:hAnsi="Calibri" w:eastAsia="Microsoft YaHei"/>
           <w:b w:val="0"/>
         </w:rPr>
-        <w:t>ShipVoice 采用前后端一体的 FastAPI 应用结构。用户端页面提供现场问题输入、音频上传、浏览器录音和结果展示；后端负责执行问答链路；管理后台负责知识库治理、运行记录、评测任务和 provider 健康检查。系统内部使用统一的 provider 抽象，使 ASR、LLM、TTS 可以在 mock provider 与真实 HTTP provider 之间切换。</w:t>
+        <w:t>ShipVoice 采用前后端一体的 FastAPI 应用结构。用户端页面提供现场问题输入、音频上传、浏览器录音和结果展示；后端负责执行问答链路；管理后台负责知识库治理、运行记录、评测任务和 provider 健康检查。系统内部使用统一的真实 provider 抽象，使 ASR、LLM、TTS 可以接入 FunASR/SenseVoice、OpenAI-compatible Qwen/vLLM 服务和 HTTP TTS 服务。</w:t>
       </w:r>
     </w:p>
     <w:p>
@@ -902,7 +916,7 @@
                 <w:b w:val="0"/>
                 <w:sz w:val="18"/>
               </w:rPr>
-              <w:t>封装 ASR、RAG、LLM、TTS、mock 与 HTTP provider。</w:t>
+              <w:t>封装真实 ASR、RAG、LLM、TTS provider；服务缺失时 fail-closed。</w:t>
             </w:r>
           </w:p>
         </w:tc>
@@ -1494,7 +1508,7 @@
           <w:rFonts w:ascii="Calibri" w:hAnsi="Calibri" w:eastAsia="Microsoft YaHei"/>
           <w:b w:val="0"/>
         </w:rPr>
-        <w:t>ASR provider 支持两种运行形态。课程稳定演示模式下，系统使用 transcript fallback 或 mock provider，保证课堂现场不依赖 GPU 和外部服务；真实链路模式下，系统可以通过 HTTP JSON provider 接入 FunASR、SenseVoiceSmall 或其他 ASR 服务。</w:t>
+        <w:t>ASR provider 通过 HTTP JSON 接入 FunASR、SenseVoiceSmall 或其他真实 ASR 服务。文本输入作为 typed input 独立处理，不被包装成语音识别结果；音频上传和浏览器录音必须交给真实 ASR 转写，服务不可用时请求失败。</w:t>
       </w:r>
     </w:p>
     <w:p>
@@ -1552,7 +1566,7 @@
           <w:rFonts w:ascii="Calibri" w:hAnsi="Calibri" w:eastAsia="Microsoft YaHei"/>
           <w:b w:val="0"/>
         </w:rPr>
-        <w:t>安全门控的设计原则不是尽可能多拒答，而是在船厂安全场景中保持“高危保守、正常放行”。正常安全问题应该进入 RAG 和 LLM，危险或越界问题应该短路拒答，并给出安全替代建议。当前安全评测集共有 55 条样本，其中 expected block 为 36 条，expected allow 为 19 条。评测结果显示，标签准确率和决策准确率均为 100%，false allow 为 0，false block 为 0。</w:t>
+        <w:t>安全门控的设计原则不是尽可能多拒答，而是在船厂安全场景中保持“高危保守、正常放行”。正常安全问题应该进入 RAG 和 LLM，危险或越界问题应该短路拒答，并给出安全替代建议。当前安全评测集共有 56 条样本，其中 expected block 为 37 条，expected allow 为 19 条。评测结果显示，标签准确率和决策准确率均为 100%，false allow 为 0，false block 为 0。</w:t>
       </w:r>
     </w:p>
     <w:p>
@@ -1613,7 +1627,7 @@
           <w:rFonts w:ascii="Calibri" w:hAnsi="Calibri" w:eastAsia="Microsoft YaHei"/>
           <w:b w:val="0"/>
         </w:rPr>
-        <w:t xml:space="preserve">语言模型层支持 mock LLM 和 OpenAI-compatible provider。mock LLM 用于稳定演示和评测回归，真实 provider 可以接入 vLLM、Ollama、OpenAI-compatible 本地服务或其他兼容接口。项目准备了 SFT seed 数据 63 条和安全门控 seed 数据 32 条，并提供 </w:t>
+        <w:t xml:space="preserve">语言模型层只保留 OpenAI-compatible provider，可接入 vLLM、Ollama、本地 Qwen 服务或其他兼容接口。项目准备了 SFT seed 数据、扩展训练数据和安全门控数据，并提供 </w:t>
       </w:r>
       <w:r>
         <w:rPr>
@@ -1627,7 +1641,7 @@
           <w:rFonts w:ascii="Calibri" w:hAnsi="Calibri" w:eastAsia="Microsoft YaHei"/>
           <w:b w:val="0"/>
         </w:rPr>
-        <w:t xml:space="preserve"> 作为 Qwen LoRA 微调脚本。</w:t>
+        <w:t xml:space="preserve"> 作为 Qwen LoRA 微调脚本。当前 pipeline 在安全门控放行后才调用 LLM；危险请求被门控拦截后不会进入 LLM。</w:t>
       </w:r>
     </w:p>
     <w:p>
@@ -1636,7 +1650,7 @@
           <w:rFonts w:ascii="Calibri" w:hAnsi="Calibri" w:eastAsia="Microsoft YaHei"/>
           <w:b w:val="0"/>
         </w:rPr>
-        <w:t>当前正式系统以 RAG 与安全门控保证回答边界，LoRA 微调作为加分实验和后续增强方向。这样安排更稳妥：对于安全问答系统，不能把安全完全寄托在微调后的模型行为上，而应由门控、检索、引用和审计共同约束。微调主要用于增强领域表达、术语理解和多轮一致性，而不是替代外部安全控制。</w:t>
+        <w:t>当前正式系统以 RAG 与安全门控保证回答边界，并将 ShipVoice LoRA 作为最终在线回答模型。这样安排更稳妥：对于安全问答系统，不能把安全完全寄托在微调后的模型行为上，而应由门控、检索、引用和审计共同约束。微调主要用于增强领域表达、术语理解和多轮一致性，而不是替代外部安全控制。</w:t>
       </w:r>
     </w:p>
     <w:p>
@@ -1653,7 +1667,133 @@
           <w:rFonts w:ascii="Calibri" w:hAnsi="Calibri" w:eastAsia="Microsoft YaHei"/>
           <w:b w:val="0"/>
         </w:rPr>
-        <w:t>TTS provider 同样支持 mock 和真实 HTTP provider。mock TTS 用于课堂稳定演示，真实链路中已验证 ChatTTS HTTP 服务。课程 A2 要求关注首段可播放延迟，因此系统在 pipeline 中记录 first_audio_ms、total_ms、asr_ms、retrieval_ms、tts_first_audio_ms 等指标。</w:t>
+        <w:t xml:space="preserve">TTS provider 通过 HTTP 接入真实语音合成服务，响应中必须返回 </w:t>
+      </w:r>
+      <w:r>
+        <w:rPr>
+          <w:rFonts w:ascii="Consolas" w:hAnsi="Consolas" w:eastAsia="Microsoft YaHei"/>
+          <w:sz w:val="19"/>
+        </w:rPr>
+        <w:t>audio_base64</w:t>
+      </w:r>
+      <w:r>
+        <w:rPr>
+          <w:rFonts w:ascii="Calibri" w:hAnsi="Calibri" w:eastAsia="Microsoft YaHei"/>
+          <w:b w:val="0"/>
+        </w:rPr>
+        <w:t xml:space="preserve"> 与 </w:t>
+      </w:r>
+      <w:r>
+        <w:rPr>
+          <w:rFonts w:ascii="Consolas" w:hAnsi="Consolas" w:eastAsia="Microsoft YaHei"/>
+          <w:sz w:val="19"/>
+        </w:rPr>
+        <w:t>mime_type</w:t>
+      </w:r>
+      <w:r>
+        <w:rPr>
+          <w:rFonts w:ascii="Calibri" w:hAnsi="Calibri" w:eastAsia="Microsoft YaHei"/>
+          <w:b w:val="0"/>
+        </w:rPr>
+        <w:t xml:space="preserve">。课程 A2 要求关注首段可播放延迟，因此系统在 pipeline 中记录 </w:t>
+      </w:r>
+      <w:r>
+        <w:rPr>
+          <w:rFonts w:ascii="Consolas" w:hAnsi="Consolas" w:eastAsia="Microsoft YaHei"/>
+          <w:sz w:val="19"/>
+        </w:rPr>
+        <w:t>first_audio_ms</w:t>
+      </w:r>
+      <w:r>
+        <w:rPr>
+          <w:rFonts w:ascii="Calibri" w:hAnsi="Calibri" w:eastAsia="Microsoft YaHei"/>
+          <w:b w:val="0"/>
+        </w:rPr>
+        <w:t>、</w:t>
+      </w:r>
+      <w:r>
+        <w:rPr>
+          <w:rFonts w:ascii="Consolas" w:hAnsi="Consolas" w:eastAsia="Microsoft YaHei"/>
+          <w:sz w:val="19"/>
+        </w:rPr>
+        <w:t>total_ms</w:t>
+      </w:r>
+      <w:r>
+        <w:rPr>
+          <w:rFonts w:ascii="Calibri" w:hAnsi="Calibri" w:eastAsia="Microsoft YaHei"/>
+          <w:b w:val="0"/>
+        </w:rPr>
+        <w:t>、</w:t>
+      </w:r>
+      <w:r>
+        <w:rPr>
+          <w:rFonts w:ascii="Consolas" w:hAnsi="Consolas" w:eastAsia="Microsoft YaHei"/>
+          <w:sz w:val="19"/>
+        </w:rPr>
+        <w:t>asr_ms</w:t>
+      </w:r>
+      <w:r>
+        <w:rPr>
+          <w:rFonts w:ascii="Calibri" w:hAnsi="Calibri" w:eastAsia="Microsoft YaHei"/>
+          <w:b w:val="0"/>
+        </w:rPr>
+        <w:t>、</w:t>
+      </w:r>
+      <w:r>
+        <w:rPr>
+          <w:rFonts w:ascii="Consolas" w:hAnsi="Consolas" w:eastAsia="Microsoft YaHei"/>
+          <w:sz w:val="19"/>
+        </w:rPr>
+        <w:t>llm_first_delta_ms</w:t>
+      </w:r>
+      <w:r>
+        <w:rPr>
+          <w:rFonts w:ascii="Calibri" w:hAnsi="Calibri" w:eastAsia="Microsoft YaHei"/>
+          <w:b w:val="0"/>
+        </w:rPr>
+        <w:t>、</w:t>
+      </w:r>
+      <w:r>
+        <w:rPr>
+          <w:rFonts w:ascii="Consolas" w:hAnsi="Consolas" w:eastAsia="Microsoft YaHei"/>
+          <w:sz w:val="19"/>
+        </w:rPr>
+        <w:t>server_first_audio_chunk_ready_ms</w:t>
+      </w:r>
+      <w:r>
+        <w:rPr>
+          <w:rFonts w:ascii="Calibri" w:hAnsi="Calibri" w:eastAsia="Microsoft YaHei"/>
+          <w:b w:val="0"/>
+        </w:rPr>
+        <w:t>、</w:t>
+      </w:r>
+      <w:r>
+        <w:rPr>
+          <w:rFonts w:ascii="Consolas" w:hAnsi="Consolas" w:eastAsia="Microsoft YaHei"/>
+          <w:sz w:val="19"/>
+        </w:rPr>
+        <w:t>server_audio_stream_complete_ms</w:t>
+      </w:r>
+      <w:r>
+        <w:rPr>
+          <w:rFonts w:ascii="Calibri" w:hAnsi="Calibri" w:eastAsia="Microsoft YaHei"/>
+          <w:b w:val="0"/>
+        </w:rPr>
+        <w:t xml:space="preserve"> 和 </w:t>
+      </w:r>
+      <w:r>
+        <w:rPr>
+          <w:rFonts w:ascii="Consolas" w:hAnsi="Consolas" w:eastAsia="Microsoft YaHei"/>
+          <w:sz w:val="19"/>
+        </w:rPr>
+        <w:t>streamed_audio_segments</w:t>
+      </w:r>
+      <w:r>
+        <w:rPr>
+          <w:rFonts w:ascii="Calibri" w:hAnsi="Calibri" w:eastAsia="Microsoft YaHei"/>
+          <w:b w:val="0"/>
+        </w:rPr>
+        <w:t xml:space="preserve"> 等指标。</w:t>
       </w:r>
     </w:p>
     <w:p>
@@ -1662,7 +1802,49 @@
           <w:rFonts w:ascii="Calibri" w:hAnsi="Calibri" w:eastAsia="Microsoft YaHei"/>
           <w:b w:val="0"/>
         </w:rPr>
-        <w:t>在 mock 稳定演示模式下，系统使用可控延迟模拟 ASR、LLM 和 TTS 阶段，平均首音频可维持在约 1.4 到 1.5 秒量级，适合课堂演示。真实 ChatTTS 链路的三条样本 smoke test 显示，平均 ASR 为 158 ms，平均检索为 165.67 ms，但平均 TTS 首音频为 14794 ms，端到端首音约 15239 ms。这一结果说明当前真实链路瓶颈主要在 TTS，而不是 ASR 或 RAG。</w:t>
+        <w:t xml:space="preserve">串行基线模式会等待 LLM 完整回答和 TTS 完整音频返回后再播放；流式改进模式则采用 LLM token 流、句级切分、TTS 分段合成和 WebSocket </w:t>
+      </w:r>
+      <w:r>
+        <w:rPr>
+          <w:rFonts w:ascii="Consolas" w:hAnsi="Consolas" w:eastAsia="Microsoft YaHei"/>
+          <w:sz w:val="19"/>
+        </w:rPr>
+        <w:t>audio_chunk</w:t>
+      </w:r>
+      <w:r>
+        <w:rPr>
+          <w:rFonts w:ascii="Calibri" w:hAnsi="Calibri" w:eastAsia="Microsoft YaHei"/>
+          <w:b w:val="0"/>
+        </w:rPr>
+        <w:t xml:space="preserve"> 队列，使首句或首段音频先播放。前端进一步记录浏览器 </w:t>
+      </w:r>
+      <w:r>
+        <w:rPr>
+          <w:rFonts w:ascii="Consolas" w:hAnsi="Consolas" w:eastAsia="Microsoft YaHei"/>
+          <w:sz w:val="19"/>
+        </w:rPr>
+        <w:t>audio.onplaying</w:t>
+      </w:r>
+      <w:r>
+        <w:rPr>
+          <w:rFonts w:ascii="Calibri" w:hAnsi="Calibri" w:eastAsia="Microsoft YaHei"/>
+          <w:b w:val="0"/>
+        </w:rPr>
+        <w:t xml:space="preserve"> 时间，避免只用服务端 ready 时间替代用户真正听到声音的时间。本轮还新增了浏览器录音路径的 </w:t>
+      </w:r>
+      <w:r>
+        <w:rPr>
+          <w:rFonts w:ascii="Consolas" w:hAnsi="Consolas" w:eastAsia="Microsoft YaHei"/>
+          <w:sz w:val="19"/>
+        </w:rPr>
+        <w:t>client_recording_stop_to_playing_ms</w:t>
+      </w:r>
+      <w:r>
+        <w:rPr>
+          <w:rFonts w:ascii="Calibri" w:hAnsi="Calibri" w:eastAsia="Microsoft YaHei"/>
+          <w:b w:val="0"/>
+        </w:rPr>
+        <w:t xml:space="preserve"> 指标，用于对齐题目建议的“用户端停止说话到首段音频开始播放”测量点。</w:t>
       </w:r>
     </w:p>
     <w:p>
@@ -1671,7 +1853,21 @@
           <w:rFonts w:ascii="Calibri" w:hAnsi="Calibri" w:eastAsia="Microsoft YaHei"/>
           <w:b w:val="0"/>
         </w:rPr>
-        <w:t>项目报告中主动保留这一瓶颈，是为了体现真实实验态度。后续优化方向包括切换更快的中文 TTS、使用流式 TTS、句级切分、首句优先合成、并行预热和固定安全提示预生成等。</w:t>
+        <w:t xml:space="preserve">真实重复实验显示，在安全门控放行的 100 个配对样本中，串行基线首段可播放延迟均值为 7967.04 ms，流式改进为 3819.65 ms，平均节省 4147.39 ms，100/100 个配对样本流式改进更快。浏览器 </w:t>
+      </w:r>
+      <w:r>
+        <w:rPr>
+          <w:rFonts w:ascii="Consolas" w:hAnsi="Consolas" w:eastAsia="Microsoft YaHei"/>
+          <w:sz w:val="19"/>
+        </w:rPr>
+        <w:t>audio.onplaying</w:t>
+      </w:r>
+      <w:r>
+        <w:rPr>
+          <w:rFonts w:ascii="Calibri" w:hAnsi="Calibri" w:eastAsia="Microsoft YaHei"/>
+          <w:b w:val="0"/>
+        </w:rPr>
+        <w:t xml:space="preserve"> 实测 20 条样本全部播放成功，平均首播时间为 4093.5 ms，P50 为 4072.0 ms，P90 为 5600.1 ms。这个结果说明当前低延迟优化已经从“计划改进”变成了可复现实验结果。</w:t>
       </w:r>
     </w:p>
     <w:p>
@@ -1756,7 +1952,7 @@
           <w:rFonts w:ascii="Calibri" w:hAnsi="Calibri" w:eastAsia="Microsoft YaHei"/>
           <w:b w:val="0"/>
         </w:rPr>
-        <w:t xml:space="preserve"> 定义了项目名称、延迟目标、mock 延迟、ASR provider、RAG provider、LLM provider、TTS provider、领域术语表、危险关键词和越界关键词。当前延迟目标设置为：first_audio_excellent 为 1800 ms，first_audio_pass 为 3000 ms，total_response_pass 为 8000 ms。</w:t>
+        <w:t xml:space="preserve"> 定义了项目名称、延迟目标、真实 ASR provider、RAG provider、真实 LLM provider、真实 TTS provider、领域术语表、危险关键词和越界关键词。当前延迟目标设置为：first_audio_excellent 为 1800 ms，first_audio_pass 为 3000 ms，total_response_pass 为 8000 ms。</w:t>
       </w:r>
     </w:p>
     <w:p>
@@ -1765,7 +1961,7 @@
           <w:rFonts w:ascii="Calibri" w:hAnsi="Calibri" w:eastAsia="Microsoft YaHei"/>
           <w:b w:val="0"/>
         </w:rPr>
-        <w:t>运行模式分为三类。mock 模式使用 transcript fallback、mock LLM 和 mock TTS，适合课堂演示、前后端功能验证和稳定回归测试。real 模式通过 HTTP provider 接入真实 ASR、LLM 和 TTS 服务，适合展示真实模型链路。full-real 或远程模式用于 AutoDL/GPU 机器，启动 FunASR/SenseVoiceSmall、ChatTTS 和 vLLM 等服务，再通过本地端口或隧道接回主应用。</w:t>
+        <w:t>运行模式统一为真实 provider 模式。ASR 通过 HTTP JSON 接入真实语音识别服务；LLM 通过 OpenAI-compatible 接口接入 ShipVoice LoRA 在线模型服务；TTS 通过 HTTP 接入真实语音合成服务。AutoDL/GPU 机器上启动 FunASR/SenseVoiceSmall、TTS 服务和 ShipVoice LoRA LLM 后，再通过本地端口或隧道接回主应用。</w:t>
       </w:r>
     </w:p>
     <w:p>
@@ -1774,7 +1970,21 @@
           <w:rFonts w:ascii="Calibri" w:hAnsi="Calibri" w:eastAsia="Microsoft YaHei"/>
           <w:b w:val="0"/>
         </w:rPr>
-        <w:t>这种设计使系统可以在不改动前端和主 pipeline 的情况下替换模型后端。对于课程答辩，这是一个重要优势：现场演示可以使用稳定 mock 模式避免外部服务失败，报告和后台则展示真实 provider smoke test 与评测证据，既稳又真实。</w:t>
+        <w:t>这种设计使系统可以在不改动前端和主 pipeline 的情况下替换真实模型后端。对于课程答辩，这是一个重要优势：评审可以从 provider health、运行日志、</w:t>
+      </w:r>
+      <w:r>
+        <w:rPr>
+          <w:rFonts w:ascii="Consolas" w:hAnsi="Consolas" w:eastAsia="Microsoft YaHei"/>
+          <w:sz w:val="19"/>
+        </w:rPr>
+        <w:t>audio_base64</w:t>
+      </w:r>
+      <w:r>
+        <w:rPr>
+          <w:rFonts w:ascii="Calibri" w:hAnsi="Calibri" w:eastAsia="Microsoft YaHei"/>
+          <w:b w:val="0"/>
+        </w:rPr>
+        <w:t xml:space="preserve"> 输出和错误记录中确认系统是否真的调用了模型服务。</w:t>
       </w:r>
     </w:p>
     <w:p>
@@ -1791,7 +2001,21 @@
           <w:rFonts w:ascii="Calibri" w:hAnsi="Calibri" w:eastAsia="Microsoft YaHei"/>
           <w:b w:val="0"/>
         </w:rPr>
-        <w:t>项目构建了四类数据资产。第一类是船厂安全知识库，当前包含 20 条可检索知识条目，字段包括 ID、标题、正文、来源、标签、风险等级和状态。第二类是安全门控评测集，共 55 条样本，覆盖 off_domain、unsafe、prompt_injection、domain_safe、boundary 等类别。第三类是真实录音清单，共 50 条，包含说话人、场景、转写、音频路径、噪声条件、ASR 原始转写、后处理命中规则等字段。第四类是微调种子数据，包括 63 条 SFT seed 和 32 条安全门控 seed。</w:t>
+        <w:t xml:space="preserve">项目构建了四类数据资产。第一类是船厂安全知识库，当前包含 20 条可检索知识条目，字段包括 ID、标题、正文、来源、标签、风险等级和状态。第二类是安全门控评测集，共 56 条样本，覆盖 off_domain、unsafe、prompt_injection、domain_safe、boundary 等类别。第三类是真实录音清单，共 50 条，包含说话人、场景、转写、音频路径、噪声条件、ASR 原始转写、后处理命中规则等字段；本轮进一步生成 </w:t>
+      </w:r>
+      <w:r>
+        <w:rPr>
+          <w:rFonts w:ascii="Consolas" w:hAnsi="Consolas" w:eastAsia="Microsoft YaHei"/>
+          <w:sz w:val="19"/>
+        </w:rPr>
+        <w:t>data/audio/audio_manifest_a2_eval.csv</w:t>
+      </w:r>
+      <w:r>
+        <w:rPr>
+          <w:rFonts w:ascii="Calibri" w:hAnsi="Calibri" w:eastAsia="Microsoft YaHei"/>
+          <w:b w:val="0"/>
+        </w:rPr>
+        <w:t>，把 50 条录音划分为基础安全问答、船厂专有名词、噪声/应急复杂处置、安全边界与对抗输入四个难度层。第四类是微调种子数据，包括 63 条 SFT seed 和 32 条安全门控 seed。</w:t>
       </w:r>
     </w:p>
     <w:p>
@@ -1917,7 +2141,7 @@
           <w:rFonts w:ascii="Calibri" w:hAnsi="Calibri" w:eastAsia="Microsoft YaHei"/>
           <w:b w:val="0"/>
         </w:rPr>
-        <w:t>7. Provider 可替换：同一套 pipeline 支持 mock 稳定演示和真实模型链路。</w:t>
+        <w:t>7. Provider 可替换：同一套 pipeline 支持不同真实 ASR、LLM、TTS 服务接入，并在服务缺失时 fail-closed。</w:t>
       </w:r>
     </w:p>
     <w:p>
@@ -1965,7 +2189,7 @@
           <w:rFonts w:ascii="Calibri" w:hAnsi="Calibri" w:eastAsia="Microsoft YaHei"/>
           <w:b w:val="0"/>
         </w:rPr>
-        <w:t>，共 55 条样本。评测脚本运行完整 pipeline，并检查系统预测的标签和 allow/block 决策是否符合预期。</w:t>
+        <w:t>，共 56 条样本。评测脚本运行完整 pipeline，并检查系统预测的标签和 allow/block 决策是否符合预期。</w:t>
       </w:r>
     </w:p>
     <w:tbl>
@@ -2090,7 +2314,7 @@
                 <w:b w:val="0"/>
                 <w:sz w:val="18"/>
               </w:rPr>
-              <w:t>55</w:t>
+              <w:t>56</w:t>
             </w:r>
           </w:p>
         </w:tc>
@@ -2146,7 +2370,7 @@
                 <w:b w:val="0"/>
                 <w:sz w:val="18"/>
               </w:rPr>
-              <w:t>36</w:t>
+              <w:t>37</w:t>
             </w:r>
           </w:p>
         </w:tc>
@@ -2551,7 +2775,7 @@
           <w:rFonts w:ascii="Calibri" w:hAnsi="Calibri" w:eastAsia="Microsoft YaHei"/>
           <w:b w:val="0"/>
         </w:rPr>
-        <w:t>按类别看，off_domain 10 条、unsafe 15 条、prompt_injection 10 条、domain_safe 15 条、boundary 5 条，均全部匹配预期。该实验说明系统能够把危险请求和越界请求挡在 LLM 之前，避免生成不安全答案。</w:t>
+        <w:t>按类别看，off_domain 11 条、unsafe 15 条、prompt_injection 10 条、domain_safe 15 条、boundary 5 条，均全部匹配预期。该实验说明系统能够把危险请求和越界请求挡在 LLM 之前，避免生成不安全答案。</w:t>
       </w:r>
     </w:p>
     <w:p>
@@ -4531,7 +4755,7 @@
         <w:pStyle w:val="Heading2"/>
       </w:pPr>
       <w:r>
-        <w:t>8.5 真实语音链路 smoke test</w:t>
+        <w:t>8.5 真实语音链路与低延迟对比</w:t>
       </w:r>
     </w:p>
     <w:p>
@@ -4540,7 +4764,63 @@
           <w:rFonts w:ascii="Calibri" w:hAnsi="Calibri" w:eastAsia="Microsoft YaHei"/>
           <w:b w:val="0"/>
         </w:rPr>
-        <w:t>真实链路在远程 GPU 环境中完成了 3 条录音样本验证，使用 FunASR/SenseVoiceSmall 作为 ASR，ChatTTS 作为 TTS。</w:t>
+        <w:t>真实链路在远程 GPU 环境中完成了 ASR、ShipVoice LoRA LLM、TTS 的 real-only 重复实验。实验使用固定 30 条录音样本、baseline 与 streaming 两种模式、每种模式 5 次重复，共 300 次运行，</w:t>
+      </w:r>
+      <w:r>
+        <w:rPr>
+          <w:rFonts w:ascii="Consolas" w:hAnsi="Consolas" w:eastAsia="Microsoft YaHei"/>
+          <w:sz w:val="19"/>
+        </w:rPr>
+        <w:t>num_ok=300</w:t>
+      </w:r>
+      <w:r>
+        <w:rPr>
+          <w:rFonts w:ascii="Calibri" w:hAnsi="Calibri" w:eastAsia="Microsoft YaHei"/>
+          <w:b w:val="0"/>
+        </w:rPr>
+        <w:t>，</w:t>
+      </w:r>
+      <w:r>
+        <w:rPr>
+          <w:rFonts w:ascii="Consolas" w:hAnsi="Consolas" w:eastAsia="Microsoft YaHei"/>
+          <w:sz w:val="19"/>
+        </w:rPr>
+        <w:t>num_failed=0</w:t>
+      </w:r>
+      <w:r>
+        <w:rPr>
+          <w:rFonts w:ascii="Calibri" w:hAnsi="Calibri" w:eastAsia="Microsoft YaHei"/>
+          <w:b w:val="0"/>
+        </w:rPr>
+        <w:t xml:space="preserve">。LLM health 记录显示在线模型为 </w:t>
+      </w:r>
+      <w:r>
+        <w:rPr>
+          <w:rFonts w:ascii="Consolas" w:hAnsi="Consolas" w:eastAsia="Microsoft YaHei"/>
+          <w:sz w:val="19"/>
+        </w:rPr>
+        <w:t>shipvoice-qwen2.5-7b-lora</w:t>
+      </w:r>
+      <w:r>
+        <w:rPr>
+          <w:rFonts w:ascii="Calibri" w:hAnsi="Calibri" w:eastAsia="Microsoft YaHei"/>
+          <w:b w:val="0"/>
+        </w:rPr>
+        <w:t xml:space="preserve">，LoRA adapter 已加载，adapter SHA256 为 </w:t>
+      </w:r>
+      <w:r>
+        <w:rPr>
+          <w:rFonts w:ascii="Consolas" w:hAnsi="Consolas" w:eastAsia="Microsoft YaHei"/>
+          <w:sz w:val="19"/>
+        </w:rPr>
+        <w:t>3462dbff405f71ed3d0b0a0d8484498a2be98ffe84ab5b2f56a2d69e7130d1cf</w:t>
+      </w:r>
+      <w:r>
+        <w:rPr>
+          <w:rFonts w:ascii="Calibri" w:hAnsi="Calibri" w:eastAsia="Microsoft YaHei"/>
+          <w:b w:val="0"/>
+        </w:rPr>
+        <w:t>。</w:t>
       </w:r>
     </w:p>
     <w:tbl>
@@ -4553,17 +4833,14 @@
         <w:tblLayout w:type="fixed"/>
       </w:tblPr>
       <w:tblGrid>
-        <w:gridCol w:w="1560"/>
-        <w:gridCol w:w="1560"/>
-        <w:gridCol w:w="1560"/>
-        <w:gridCol w:w="1560"/>
-        <w:gridCol w:w="1560"/>
-        <w:gridCol w:w="1560"/>
+        <w:gridCol w:w="2200"/>
+        <w:gridCol w:w="2600"/>
+        <w:gridCol w:w="4560"/>
       </w:tblGrid>
       <w:tr>
         <w:tc>
           <w:tcPr>
-            <w:tcW w:type="dxa" w:w="1560"/>
+            <w:tcW w:type="dxa" w:w="2200"/>
             <w:tcMar>
               <w:top w:w="80" w:type="dxa"/>
               <w:start w:w="120" w:type="dxa"/>
@@ -4585,13 +4862,13 @@
                 <w:b/>
                 <w:sz w:val="19"/>
               </w:rPr>
-              <w:t>样本</w:t>
+              <w:t>指标</w:t>
             </w:r>
           </w:p>
         </w:tc>
         <w:tc>
           <w:tcPr>
-            <w:tcW w:type="dxa" w:w="1560"/>
+            <w:tcW w:type="dxa" w:w="2600"/>
             <w:tcMar>
               <w:top w:w="80" w:type="dxa"/>
               <w:start w:w="120" w:type="dxa"/>
@@ -4613,13 +4890,13 @@
                 <w:b/>
                 <w:sz w:val="19"/>
               </w:rPr>
-              <w:t>转写文本</w:t>
+              <w:t>串行基线 baseline</w:t>
             </w:r>
           </w:p>
         </w:tc>
         <w:tc>
           <w:tcPr>
-            <w:tcW w:type="dxa" w:w="1560"/>
+            <w:tcW w:type="dxa" w:w="4560"/>
             <w:tcMar>
               <w:top w:w="80" w:type="dxa"/>
               <w:start w:w="120" w:type="dxa"/>
@@ -4641,13 +4918,827 @@
                 <w:b/>
                 <w:sz w:val="19"/>
               </w:rPr>
-              <w:t>ASR 耗时</w:t>
+              <w:t>流式改进 streaming</w:t>
+            </w:r>
+          </w:p>
+        </w:tc>
+      </w:tr>
+      <w:tr>
+        <w:tc>
+          <w:tcPr>
+            <w:tcW w:type="dxa" w:w="2200"/>
+            <w:tcMar>
+              <w:top w:w="80" w:type="dxa"/>
+              <w:start w:w="120" w:type="dxa"/>
+              <w:bottom w:w="80" w:type="dxa"/>
+              <w:end w:w="120" w:type="dxa"/>
+            </w:tcMar>
+            <w:vAlign w:val="center"/>
+          </w:tcPr>
+          <w:p>
+            <w:pPr>
+              <w:spacing w:before="0" w:after="40" w:line="276" w:lineRule="auto"/>
+              <w:jc w:val="left"/>
+            </w:pPr>
+            <w:r/>
+            <w:r>
+              <w:rPr>
+                <w:rFonts w:ascii="Calibri" w:hAnsi="Calibri" w:eastAsia="Microsoft YaHei"/>
+                <w:b w:val="0"/>
+                <w:sz w:val="18"/>
+              </w:rPr>
+              <w:t>总运行次数</w:t>
             </w:r>
           </w:p>
         </w:tc>
         <w:tc>
           <w:tcPr>
-            <w:tcW w:type="dxa" w:w="1560"/>
+            <w:tcW w:type="dxa" w:w="2600"/>
+            <w:tcMar>
+              <w:top w:w="80" w:type="dxa"/>
+              <w:start w:w="120" w:type="dxa"/>
+              <w:bottom w:w="80" w:type="dxa"/>
+              <w:end w:w="120" w:type="dxa"/>
+            </w:tcMar>
+            <w:vAlign w:val="center"/>
+          </w:tcPr>
+          <w:p>
+            <w:pPr>
+              <w:spacing w:before="0" w:after="40" w:line="276" w:lineRule="auto"/>
+              <w:jc w:val="left"/>
+            </w:pPr>
+            <w:r/>
+            <w:r>
+              <w:rPr>
+                <w:rFonts w:ascii="Calibri" w:hAnsi="Calibri" w:eastAsia="Microsoft YaHei"/>
+                <w:b w:val="0"/>
+                <w:sz w:val="18"/>
+              </w:rPr>
+              <w:t>150</w:t>
+            </w:r>
+          </w:p>
+        </w:tc>
+        <w:tc>
+          <w:tcPr>
+            <w:tcW w:type="dxa" w:w="4560"/>
+            <w:tcMar>
+              <w:top w:w="80" w:type="dxa"/>
+              <w:start w:w="120" w:type="dxa"/>
+              <w:bottom w:w="80" w:type="dxa"/>
+              <w:end w:w="120" w:type="dxa"/>
+            </w:tcMar>
+            <w:vAlign w:val="center"/>
+          </w:tcPr>
+          <w:p>
+            <w:pPr>
+              <w:spacing w:before="0" w:after="40" w:line="276" w:lineRule="auto"/>
+              <w:jc w:val="left"/>
+            </w:pPr>
+            <w:r/>
+            <w:r>
+              <w:rPr>
+                <w:rFonts w:ascii="Calibri" w:hAnsi="Calibri" w:eastAsia="Microsoft YaHei"/>
+                <w:b w:val="0"/>
+                <w:sz w:val="18"/>
+              </w:rPr>
+              <w:t>150</w:t>
+            </w:r>
+          </w:p>
+        </w:tc>
+      </w:tr>
+      <w:tr>
+        <w:tc>
+          <w:tcPr>
+            <w:tcW w:type="dxa" w:w="2200"/>
+            <w:tcMar>
+              <w:top w:w="80" w:type="dxa"/>
+              <w:start w:w="120" w:type="dxa"/>
+              <w:bottom w:w="80" w:type="dxa"/>
+              <w:end w:w="120" w:type="dxa"/>
+            </w:tcMar>
+            <w:vAlign w:val="center"/>
+          </w:tcPr>
+          <w:p>
+            <w:pPr>
+              <w:spacing w:before="0" w:after="40" w:line="276" w:lineRule="auto"/>
+              <w:jc w:val="left"/>
+            </w:pPr>
+            <w:r/>
+            <w:r>
+              <w:rPr>
+                <w:rFonts w:ascii="Calibri" w:hAnsi="Calibri" w:eastAsia="Microsoft YaHei"/>
+                <w:b w:val="0"/>
+                <w:sz w:val="18"/>
+              </w:rPr>
+              <w:t>失败次数</w:t>
+            </w:r>
+          </w:p>
+        </w:tc>
+        <w:tc>
+          <w:tcPr>
+            <w:tcW w:type="dxa" w:w="2600"/>
+            <w:tcMar>
+              <w:top w:w="80" w:type="dxa"/>
+              <w:start w:w="120" w:type="dxa"/>
+              <w:bottom w:w="80" w:type="dxa"/>
+              <w:end w:w="120" w:type="dxa"/>
+            </w:tcMar>
+            <w:vAlign w:val="center"/>
+          </w:tcPr>
+          <w:p>
+            <w:pPr>
+              <w:spacing w:before="0" w:after="40" w:line="276" w:lineRule="auto"/>
+              <w:jc w:val="left"/>
+            </w:pPr>
+            <w:r/>
+            <w:r>
+              <w:rPr>
+                <w:rFonts w:ascii="Calibri" w:hAnsi="Calibri" w:eastAsia="Microsoft YaHei"/>
+                <w:b w:val="0"/>
+                <w:sz w:val="18"/>
+              </w:rPr>
+              <w:t>0</w:t>
+            </w:r>
+          </w:p>
+        </w:tc>
+        <w:tc>
+          <w:tcPr>
+            <w:tcW w:type="dxa" w:w="4560"/>
+            <w:tcMar>
+              <w:top w:w="80" w:type="dxa"/>
+              <w:start w:w="120" w:type="dxa"/>
+              <w:bottom w:w="80" w:type="dxa"/>
+              <w:end w:w="120" w:type="dxa"/>
+            </w:tcMar>
+            <w:vAlign w:val="center"/>
+          </w:tcPr>
+          <w:p>
+            <w:pPr>
+              <w:spacing w:before="0" w:after="40" w:line="276" w:lineRule="auto"/>
+              <w:jc w:val="left"/>
+            </w:pPr>
+            <w:r/>
+            <w:r>
+              <w:rPr>
+                <w:rFonts w:ascii="Calibri" w:hAnsi="Calibri" w:eastAsia="Microsoft YaHei"/>
+                <w:b w:val="0"/>
+                <w:sz w:val="18"/>
+              </w:rPr>
+              <w:t>0</w:t>
+            </w:r>
+          </w:p>
+        </w:tc>
+      </w:tr>
+      <w:tr>
+        <w:tc>
+          <w:tcPr>
+            <w:tcW w:type="dxa" w:w="2200"/>
+            <w:tcMar>
+              <w:top w:w="80" w:type="dxa"/>
+              <w:start w:w="120" w:type="dxa"/>
+              <w:bottom w:w="80" w:type="dxa"/>
+              <w:end w:w="120" w:type="dxa"/>
+            </w:tcMar>
+            <w:vAlign w:val="center"/>
+          </w:tcPr>
+          <w:p>
+            <w:pPr>
+              <w:spacing w:before="0" w:after="40" w:line="276" w:lineRule="auto"/>
+              <w:jc w:val="left"/>
+            </w:pPr>
+            <w:r/>
+            <w:r>
+              <w:rPr>
+                <w:rFonts w:ascii="Calibri" w:hAnsi="Calibri" w:eastAsia="Microsoft YaHei"/>
+                <w:b w:val="0"/>
+                <w:sz w:val="18"/>
+              </w:rPr>
+              <w:t>gate-allowed 样本数</w:t>
+            </w:r>
+          </w:p>
+        </w:tc>
+        <w:tc>
+          <w:tcPr>
+            <w:tcW w:type="dxa" w:w="2600"/>
+            <w:tcMar>
+              <w:top w:w="80" w:type="dxa"/>
+              <w:start w:w="120" w:type="dxa"/>
+              <w:bottom w:w="80" w:type="dxa"/>
+              <w:end w:w="120" w:type="dxa"/>
+            </w:tcMar>
+            <w:vAlign w:val="center"/>
+          </w:tcPr>
+          <w:p>
+            <w:pPr>
+              <w:spacing w:before="0" w:after="40" w:line="276" w:lineRule="auto"/>
+              <w:jc w:val="left"/>
+            </w:pPr>
+            <w:r/>
+            <w:r>
+              <w:rPr>
+                <w:rFonts w:ascii="Calibri" w:hAnsi="Calibri" w:eastAsia="Microsoft YaHei"/>
+                <w:b w:val="0"/>
+                <w:sz w:val="18"/>
+              </w:rPr>
+              <w:t>100</w:t>
+            </w:r>
+          </w:p>
+        </w:tc>
+        <w:tc>
+          <w:tcPr>
+            <w:tcW w:type="dxa" w:w="4560"/>
+            <w:tcMar>
+              <w:top w:w="80" w:type="dxa"/>
+              <w:start w:w="120" w:type="dxa"/>
+              <w:bottom w:w="80" w:type="dxa"/>
+              <w:end w:w="120" w:type="dxa"/>
+            </w:tcMar>
+            <w:vAlign w:val="center"/>
+          </w:tcPr>
+          <w:p>
+            <w:pPr>
+              <w:spacing w:before="0" w:after="40" w:line="276" w:lineRule="auto"/>
+              <w:jc w:val="left"/>
+            </w:pPr>
+            <w:r/>
+            <w:r>
+              <w:rPr>
+                <w:rFonts w:ascii="Calibri" w:hAnsi="Calibri" w:eastAsia="Microsoft YaHei"/>
+                <w:b w:val="0"/>
+                <w:sz w:val="18"/>
+              </w:rPr>
+              <w:t>100</w:t>
+            </w:r>
+          </w:p>
+        </w:tc>
+      </w:tr>
+      <w:tr>
+        <w:tc>
+          <w:tcPr>
+            <w:tcW w:type="dxa" w:w="2200"/>
+            <w:tcMar>
+              <w:top w:w="80" w:type="dxa"/>
+              <w:start w:w="120" w:type="dxa"/>
+              <w:bottom w:w="80" w:type="dxa"/>
+              <w:end w:w="120" w:type="dxa"/>
+            </w:tcMar>
+            <w:vAlign w:val="center"/>
+          </w:tcPr>
+          <w:p>
+            <w:pPr>
+              <w:spacing w:before="0" w:after="40" w:line="276" w:lineRule="auto"/>
+              <w:jc w:val="left"/>
+            </w:pPr>
+            <w:r/>
+            <w:r>
+              <w:rPr>
+                <w:rFonts w:ascii="Calibri" w:hAnsi="Calibri" w:eastAsia="Microsoft YaHei"/>
+                <w:b w:val="0"/>
+                <w:sz w:val="18"/>
+              </w:rPr>
+              <w:t>ASR 均值</w:t>
+            </w:r>
+          </w:p>
+        </w:tc>
+        <w:tc>
+          <w:tcPr>
+            <w:tcW w:type="dxa" w:w="2600"/>
+            <w:tcMar>
+              <w:top w:w="80" w:type="dxa"/>
+              <w:start w:w="120" w:type="dxa"/>
+              <w:bottom w:w="80" w:type="dxa"/>
+              <w:end w:w="120" w:type="dxa"/>
+            </w:tcMar>
+            <w:vAlign w:val="center"/>
+          </w:tcPr>
+          <w:p>
+            <w:pPr>
+              <w:spacing w:before="0" w:after="40" w:line="276" w:lineRule="auto"/>
+              <w:jc w:val="left"/>
+            </w:pPr>
+            <w:r/>
+            <w:r>
+              <w:rPr>
+                <w:rFonts w:ascii="Calibri" w:hAnsi="Calibri" w:eastAsia="Microsoft YaHei"/>
+                <w:b w:val="0"/>
+                <w:sz w:val="18"/>
+              </w:rPr>
+              <w:t>326.31 ms</w:t>
+            </w:r>
+          </w:p>
+        </w:tc>
+        <w:tc>
+          <w:tcPr>
+            <w:tcW w:type="dxa" w:w="4560"/>
+            <w:tcMar>
+              <w:top w:w="80" w:type="dxa"/>
+              <w:start w:w="120" w:type="dxa"/>
+              <w:bottom w:w="80" w:type="dxa"/>
+              <w:end w:w="120" w:type="dxa"/>
+            </w:tcMar>
+            <w:vAlign w:val="center"/>
+          </w:tcPr>
+          <w:p>
+            <w:pPr>
+              <w:spacing w:before="0" w:after="40" w:line="276" w:lineRule="auto"/>
+              <w:jc w:val="left"/>
+            </w:pPr>
+            <w:r/>
+            <w:r>
+              <w:rPr>
+                <w:rFonts w:ascii="Calibri" w:hAnsi="Calibri" w:eastAsia="Microsoft YaHei"/>
+                <w:b w:val="0"/>
+                <w:sz w:val="18"/>
+              </w:rPr>
+              <w:t>317.63 ms</w:t>
+            </w:r>
+          </w:p>
+        </w:tc>
+      </w:tr>
+      <w:tr>
+        <w:tc>
+          <w:tcPr>
+            <w:tcW w:type="dxa" w:w="2200"/>
+            <w:tcMar>
+              <w:top w:w="80" w:type="dxa"/>
+              <w:start w:w="120" w:type="dxa"/>
+              <w:bottom w:w="80" w:type="dxa"/>
+              <w:end w:w="120" w:type="dxa"/>
+            </w:tcMar>
+            <w:vAlign w:val="center"/>
+          </w:tcPr>
+          <w:p>
+            <w:pPr>
+              <w:spacing w:before="0" w:after="40" w:line="276" w:lineRule="auto"/>
+              <w:jc w:val="left"/>
+            </w:pPr>
+            <w:r/>
+            <w:r>
+              <w:rPr>
+                <w:rFonts w:ascii="Calibri" w:hAnsi="Calibri" w:eastAsia="Microsoft YaHei"/>
+                <w:b w:val="0"/>
+                <w:sz w:val="18"/>
+              </w:rPr>
+              <w:t>LLM 首 token 均值</w:t>
+            </w:r>
+          </w:p>
+        </w:tc>
+        <w:tc>
+          <w:tcPr>
+            <w:tcW w:type="dxa" w:w="2600"/>
+            <w:tcMar>
+              <w:top w:w="80" w:type="dxa"/>
+              <w:start w:w="120" w:type="dxa"/>
+              <w:bottom w:w="80" w:type="dxa"/>
+              <w:end w:w="120" w:type="dxa"/>
+            </w:tcMar>
+            <w:vAlign w:val="center"/>
+          </w:tcPr>
+          <w:p>
+            <w:pPr>
+              <w:spacing w:before="0" w:after="40" w:line="276" w:lineRule="auto"/>
+              <w:jc w:val="left"/>
+            </w:pPr>
+            <w:r/>
+            <w:r>
+              <w:rPr>
+                <w:rFonts w:ascii="Calibri" w:hAnsi="Calibri" w:eastAsia="Microsoft YaHei"/>
+                <w:b w:val="0"/>
+                <w:sz w:val="18"/>
+              </w:rPr>
+              <w:t>0 ms</w:t>
+            </w:r>
+          </w:p>
+        </w:tc>
+        <w:tc>
+          <w:tcPr>
+            <w:tcW w:type="dxa" w:w="4560"/>
+            <w:tcMar>
+              <w:top w:w="80" w:type="dxa"/>
+              <w:start w:w="120" w:type="dxa"/>
+              <w:bottom w:w="80" w:type="dxa"/>
+              <w:end w:w="120" w:type="dxa"/>
+            </w:tcMar>
+            <w:vAlign w:val="center"/>
+          </w:tcPr>
+          <w:p>
+            <w:pPr>
+              <w:spacing w:before="0" w:after="40" w:line="276" w:lineRule="auto"/>
+              <w:jc w:val="left"/>
+            </w:pPr>
+            <w:r/>
+            <w:r>
+              <w:rPr>
+                <w:rFonts w:ascii="Calibri" w:hAnsi="Calibri" w:eastAsia="Microsoft YaHei"/>
+                <w:b w:val="0"/>
+                <w:sz w:val="18"/>
+              </w:rPr>
+              <w:t>219.29 ms</w:t>
+            </w:r>
+          </w:p>
+        </w:tc>
+      </w:tr>
+      <w:tr>
+        <w:tc>
+          <w:tcPr>
+            <w:tcW w:type="dxa" w:w="2200"/>
+            <w:tcMar>
+              <w:top w:w="80" w:type="dxa"/>
+              <w:start w:w="120" w:type="dxa"/>
+              <w:bottom w:w="80" w:type="dxa"/>
+              <w:end w:w="120" w:type="dxa"/>
+            </w:tcMar>
+            <w:vAlign w:val="center"/>
+          </w:tcPr>
+          <w:p>
+            <w:pPr>
+              <w:spacing w:before="0" w:after="40" w:line="276" w:lineRule="auto"/>
+              <w:jc w:val="left"/>
+            </w:pPr>
+            <w:r/>
+            <w:r>
+              <w:rPr>
+                <w:rFonts w:ascii="Calibri" w:hAnsi="Calibri" w:eastAsia="Microsoft YaHei"/>
+                <w:b w:val="0"/>
+                <w:sz w:val="18"/>
+              </w:rPr>
+              <w:t>首段可播放延迟均值</w:t>
+            </w:r>
+          </w:p>
+        </w:tc>
+        <w:tc>
+          <w:tcPr>
+            <w:tcW w:type="dxa" w:w="2600"/>
+            <w:tcMar>
+              <w:top w:w="80" w:type="dxa"/>
+              <w:start w:w="120" w:type="dxa"/>
+              <w:bottom w:w="80" w:type="dxa"/>
+              <w:end w:w="120" w:type="dxa"/>
+            </w:tcMar>
+            <w:vAlign w:val="center"/>
+          </w:tcPr>
+          <w:p>
+            <w:pPr>
+              <w:spacing w:before="0" w:after="40" w:line="276" w:lineRule="auto"/>
+              <w:jc w:val="left"/>
+            </w:pPr>
+            <w:r/>
+            <w:r>
+              <w:rPr>
+                <w:rFonts w:ascii="Calibri" w:hAnsi="Calibri" w:eastAsia="Microsoft YaHei"/>
+                <w:b w:val="0"/>
+                <w:sz w:val="18"/>
+              </w:rPr>
+              <w:t>7967.04 ms</w:t>
+            </w:r>
+          </w:p>
+        </w:tc>
+        <w:tc>
+          <w:tcPr>
+            <w:tcW w:type="dxa" w:w="4560"/>
+            <w:tcMar>
+              <w:top w:w="80" w:type="dxa"/>
+              <w:start w:w="120" w:type="dxa"/>
+              <w:bottom w:w="80" w:type="dxa"/>
+              <w:end w:w="120" w:type="dxa"/>
+            </w:tcMar>
+            <w:vAlign w:val="center"/>
+          </w:tcPr>
+          <w:p>
+            <w:pPr>
+              <w:spacing w:before="0" w:after="40" w:line="276" w:lineRule="auto"/>
+              <w:jc w:val="left"/>
+            </w:pPr>
+            <w:r/>
+            <w:r>
+              <w:rPr>
+                <w:rFonts w:ascii="Calibri" w:hAnsi="Calibri" w:eastAsia="Microsoft YaHei"/>
+                <w:b w:val="0"/>
+                <w:sz w:val="18"/>
+              </w:rPr>
+              <w:t>3819.65 ms</w:t>
+            </w:r>
+          </w:p>
+        </w:tc>
+      </w:tr>
+      <w:tr>
+        <w:tc>
+          <w:tcPr>
+            <w:tcW w:type="dxa" w:w="2200"/>
+            <w:tcMar>
+              <w:top w:w="80" w:type="dxa"/>
+              <w:start w:w="120" w:type="dxa"/>
+              <w:bottom w:w="80" w:type="dxa"/>
+              <w:end w:w="120" w:type="dxa"/>
+            </w:tcMar>
+            <w:vAlign w:val="center"/>
+          </w:tcPr>
+          <w:p>
+            <w:pPr>
+              <w:spacing w:before="0" w:after="40" w:line="276" w:lineRule="auto"/>
+              <w:jc w:val="left"/>
+            </w:pPr>
+            <w:r/>
+            <w:r>
+              <w:rPr>
+                <w:rFonts w:ascii="Calibri" w:hAnsi="Calibri" w:eastAsia="Microsoft YaHei"/>
+                <w:b w:val="0"/>
+                <w:sz w:val="18"/>
+              </w:rPr>
+              <w:t>首段可播放延迟 P50</w:t>
+            </w:r>
+          </w:p>
+        </w:tc>
+        <w:tc>
+          <w:tcPr>
+            <w:tcW w:type="dxa" w:w="2600"/>
+            <w:tcMar>
+              <w:top w:w="80" w:type="dxa"/>
+              <w:start w:w="120" w:type="dxa"/>
+              <w:bottom w:w="80" w:type="dxa"/>
+              <w:end w:w="120" w:type="dxa"/>
+            </w:tcMar>
+            <w:vAlign w:val="center"/>
+          </w:tcPr>
+          <w:p>
+            <w:pPr>
+              <w:spacing w:before="0" w:after="40" w:line="276" w:lineRule="auto"/>
+              <w:jc w:val="left"/>
+            </w:pPr>
+            <w:r/>
+            <w:r>
+              <w:rPr>
+                <w:rFonts w:ascii="Calibri" w:hAnsi="Calibri" w:eastAsia="Microsoft YaHei"/>
+                <w:b w:val="0"/>
+                <w:sz w:val="18"/>
+              </w:rPr>
+              <w:t>7373.5 ms</w:t>
+            </w:r>
+          </w:p>
+        </w:tc>
+        <w:tc>
+          <w:tcPr>
+            <w:tcW w:type="dxa" w:w="4560"/>
+            <w:tcMar>
+              <w:top w:w="80" w:type="dxa"/>
+              <w:start w:w="120" w:type="dxa"/>
+              <w:bottom w:w="80" w:type="dxa"/>
+              <w:end w:w="120" w:type="dxa"/>
+            </w:tcMar>
+            <w:vAlign w:val="center"/>
+          </w:tcPr>
+          <w:p>
+            <w:pPr>
+              <w:spacing w:before="0" w:after="40" w:line="276" w:lineRule="auto"/>
+              <w:jc w:val="left"/>
+            </w:pPr>
+            <w:r/>
+            <w:r>
+              <w:rPr>
+                <w:rFonts w:ascii="Calibri" w:hAnsi="Calibri" w:eastAsia="Microsoft YaHei"/>
+                <w:b w:val="0"/>
+                <w:sz w:val="18"/>
+              </w:rPr>
+              <w:t>3869.0 ms</w:t>
+            </w:r>
+          </w:p>
+        </w:tc>
+      </w:tr>
+      <w:tr>
+        <w:tc>
+          <w:tcPr>
+            <w:tcW w:type="dxa" w:w="2200"/>
+            <w:tcMar>
+              <w:top w:w="80" w:type="dxa"/>
+              <w:start w:w="120" w:type="dxa"/>
+              <w:bottom w:w="80" w:type="dxa"/>
+              <w:end w:w="120" w:type="dxa"/>
+            </w:tcMar>
+            <w:vAlign w:val="center"/>
+          </w:tcPr>
+          <w:p>
+            <w:pPr>
+              <w:spacing w:before="0" w:after="40" w:line="276" w:lineRule="auto"/>
+              <w:jc w:val="left"/>
+            </w:pPr>
+            <w:r/>
+            <w:r>
+              <w:rPr>
+                <w:rFonts w:ascii="Calibri" w:hAnsi="Calibri" w:eastAsia="Microsoft YaHei"/>
+                <w:b w:val="0"/>
+                <w:sz w:val="18"/>
+              </w:rPr>
+              <w:t>首段可播放延迟 P90</w:t>
+            </w:r>
+          </w:p>
+        </w:tc>
+        <w:tc>
+          <w:tcPr>
+            <w:tcW w:type="dxa" w:w="2600"/>
+            <w:tcMar>
+              <w:top w:w="80" w:type="dxa"/>
+              <w:start w:w="120" w:type="dxa"/>
+              <w:bottom w:w="80" w:type="dxa"/>
+              <w:end w:w="120" w:type="dxa"/>
+            </w:tcMar>
+            <w:vAlign w:val="center"/>
+          </w:tcPr>
+          <w:p>
+            <w:pPr>
+              <w:spacing w:before="0" w:after="40" w:line="276" w:lineRule="auto"/>
+              <w:jc w:val="left"/>
+            </w:pPr>
+            <w:r/>
+            <w:r>
+              <w:rPr>
+                <w:rFonts w:ascii="Calibri" w:hAnsi="Calibri" w:eastAsia="Microsoft YaHei"/>
+                <w:b w:val="0"/>
+                <w:sz w:val="18"/>
+              </w:rPr>
+              <w:t>11987.5 ms</w:t>
+            </w:r>
+          </w:p>
+        </w:tc>
+        <w:tc>
+          <w:tcPr>
+            <w:tcW w:type="dxa" w:w="4560"/>
+            <w:tcMar>
+              <w:top w:w="80" w:type="dxa"/>
+              <w:start w:w="120" w:type="dxa"/>
+              <w:bottom w:w="80" w:type="dxa"/>
+              <w:end w:w="120" w:type="dxa"/>
+            </w:tcMar>
+            <w:vAlign w:val="center"/>
+          </w:tcPr>
+          <w:p>
+            <w:pPr>
+              <w:spacing w:before="0" w:after="40" w:line="276" w:lineRule="auto"/>
+              <w:jc w:val="left"/>
+            </w:pPr>
+            <w:r/>
+            <w:r>
+              <w:rPr>
+                <w:rFonts w:ascii="Calibri" w:hAnsi="Calibri" w:eastAsia="Microsoft YaHei"/>
+                <w:b w:val="0"/>
+                <w:sz w:val="18"/>
+              </w:rPr>
+              <w:t>5110.7 ms</w:t>
+            </w:r>
+          </w:p>
+        </w:tc>
+      </w:tr>
+      <w:tr>
+        <w:tc>
+          <w:tcPr>
+            <w:tcW w:type="dxa" w:w="2200"/>
+            <w:tcMar>
+              <w:top w:w="80" w:type="dxa"/>
+              <w:start w:w="120" w:type="dxa"/>
+              <w:bottom w:w="80" w:type="dxa"/>
+              <w:end w:w="120" w:type="dxa"/>
+            </w:tcMar>
+            <w:vAlign w:val="center"/>
+          </w:tcPr>
+          <w:p>
+            <w:pPr>
+              <w:spacing w:before="0" w:after="40" w:line="276" w:lineRule="auto"/>
+              <w:jc w:val="left"/>
+            </w:pPr>
+            <w:r/>
+            <w:r>
+              <w:rPr>
+                <w:rFonts w:ascii="Calibri" w:hAnsi="Calibri" w:eastAsia="Microsoft YaHei"/>
+                <w:b w:val="0"/>
+                <w:sz w:val="18"/>
+              </w:rPr>
+              <w:t>流式音频片段均值</w:t>
+            </w:r>
+          </w:p>
+        </w:tc>
+        <w:tc>
+          <w:tcPr>
+            <w:tcW w:type="dxa" w:w="2600"/>
+            <w:tcMar>
+              <w:top w:w="80" w:type="dxa"/>
+              <w:start w:w="120" w:type="dxa"/>
+              <w:bottom w:w="80" w:type="dxa"/>
+              <w:end w:w="120" w:type="dxa"/>
+            </w:tcMar>
+            <w:vAlign w:val="center"/>
+          </w:tcPr>
+          <w:p>
+            <w:pPr>
+              <w:spacing w:before="0" w:after="40" w:line="276" w:lineRule="auto"/>
+              <w:jc w:val="left"/>
+            </w:pPr>
+            <w:r/>
+            <w:r>
+              <w:rPr>
+                <w:rFonts w:ascii="Calibri" w:hAnsi="Calibri" w:eastAsia="Microsoft YaHei"/>
+                <w:b w:val="0"/>
+                <w:sz w:val="18"/>
+              </w:rPr>
+              <w:t>0</w:t>
+            </w:r>
+          </w:p>
+        </w:tc>
+        <w:tc>
+          <w:tcPr>
+            <w:tcW w:type="dxa" w:w="4560"/>
+            <w:tcMar>
+              <w:top w:w="80" w:type="dxa"/>
+              <w:start w:w="120" w:type="dxa"/>
+              <w:bottom w:w="80" w:type="dxa"/>
+              <w:end w:w="120" w:type="dxa"/>
+            </w:tcMar>
+            <w:vAlign w:val="center"/>
+          </w:tcPr>
+          <w:p>
+            <w:pPr>
+              <w:spacing w:before="0" w:after="40" w:line="276" w:lineRule="auto"/>
+              <w:jc w:val="left"/>
+            </w:pPr>
+            <w:r/>
+            <w:r>
+              <w:rPr>
+                <w:rFonts w:ascii="Calibri" w:hAnsi="Calibri" w:eastAsia="Microsoft YaHei"/>
+                <w:b w:val="0"/>
+                <w:sz w:val="18"/>
+              </w:rPr>
+              <w:t>3.87</w:t>
+            </w:r>
+          </w:p>
+        </w:tc>
+      </w:tr>
+    </w:tbl>
+    <w:p/>
+    <w:p>
+      <w:r>
+        <w:rPr>
+          <w:rFonts w:ascii="Calibri" w:hAnsi="Calibri" w:eastAsia="Microsoft YaHei"/>
+          <w:b w:val="0"/>
+        </w:rPr>
+        <w:t>对 100 个 gate-allowed 配对样本计算差值，流式改进 100/100 次首段音频更快，平均节省 4147.39 ms，P50 节省 3416.0 ms，P90 节省 7659.0 ms。这里的“首段可播放延迟”不是总回答完成时间，而是用户开始获得语音反馈的时间，正好对应 A2 对低延迟体验的要求。</w:t>
+      </w:r>
+    </w:p>
+    <w:p>
+      <w:r>
+        <w:rPr>
+          <w:rFonts w:ascii="Calibri" w:hAnsi="Calibri" w:eastAsia="Microsoft YaHei"/>
+          <w:b w:val="0"/>
+        </w:rPr>
+        <w:t xml:space="preserve">另外，浏览器端 </w:t>
+      </w:r>
+      <w:r>
+        <w:rPr>
+          <w:rFonts w:ascii="Consolas" w:hAnsi="Consolas" w:eastAsia="Microsoft YaHei"/>
+          <w:sz w:val="19"/>
+        </w:rPr>
+        <w:t>audio.onplaying</w:t>
+      </w:r>
+      <w:r>
+        <w:rPr>
+          <w:rFonts w:ascii="Calibri" w:hAnsi="Calibri" w:eastAsia="Microsoft YaHei"/>
+          <w:b w:val="0"/>
+        </w:rPr>
+        <w:t xml:space="preserve"> 观测使用 20 条样本，结果为 20/20 播放成功，平均 4093.5 ms，P50 4072.0 ms，P90 5600.1 ms。这一组数据更贴近实际演示，因为它记录的是浏览器音频元素真正进入播放状态的时间。</w:t>
+      </w:r>
+    </w:p>
+    <w:p>
+      <w:pPr>
+        <w:pStyle w:val="Heading2"/>
+      </w:pPr>
+      <w:r>
+        <w:t>8.6 主观等待体验量化</w:t>
+      </w:r>
+    </w:p>
+    <w:p>
+      <w:r>
+        <w:rPr>
+          <w:rFonts w:ascii="Calibri" w:hAnsi="Calibri" w:eastAsia="Microsoft YaHei"/>
+          <w:b w:val="0"/>
+        </w:rPr>
+        <w:t>课程要求不仅比较客观延迟，也要围绕主观等待体验做可量化对比。本项目没有伪造真人问卷，而是采用自动化代理评分：把真实链路记录到的首段可播放延迟映射为 1-5 分等待体验等级。评分规则为：2500 ms 以内记 5 分，4000 ms 以内记 4 分，6000 ms 以内记 3 分，9000 ms 以内记 2 分，超过 9000 ms 记 1 分。</w:t>
+      </w:r>
+    </w:p>
+    <w:tbl>
+      <w:tblPr>
+        <w:tblStyle w:val="TableGrid"/>
+        <w:tblW w:type="dxa" w:w="9360"/>
+        <w:jc w:val="left"/>
+        <w:tblLook w:firstColumn="1" w:firstRow="1" w:lastColumn="0" w:lastRow="0" w:noHBand="0" w:noVBand="1" w:val="04A0"/>
+        <w:tblInd w:w="120" w:type="dxa"/>
+        <w:tblLayout w:type="fixed"/>
+      </w:tblPr>
+      <w:tblGrid>
+        <w:gridCol w:w="2200"/>
+        <w:gridCol w:w="2600"/>
+        <w:gridCol w:w="4560"/>
+      </w:tblGrid>
+      <w:tr>
+        <w:tc>
+          <w:tcPr>
+            <w:tcW w:type="dxa" w:w="2200"/>
             <w:tcMar>
               <w:top w:w="80" w:type="dxa"/>
               <w:start w:w="120" w:type="dxa"/>
@@ -4669,13 +5760,13 @@
                 <w:b/>
                 <w:sz w:val="19"/>
               </w:rPr>
-              <w:t>检索耗时</w:t>
+              <w:t>指标</w:t>
             </w:r>
           </w:p>
         </w:tc>
         <w:tc>
           <w:tcPr>
-            <w:tcW w:type="dxa" w:w="1560"/>
+            <w:tcW w:type="dxa" w:w="2600"/>
             <w:tcMar>
               <w:top w:w="80" w:type="dxa"/>
               <w:start w:w="120" w:type="dxa"/>
@@ -4697,13 +5788,13 @@
                 <w:b/>
                 <w:sz w:val="19"/>
               </w:rPr>
-              <w:t>TTS 首音</w:t>
+              <w:t>串行基线 baseline</w:t>
             </w:r>
           </w:p>
         </w:tc>
         <w:tc>
           <w:tcPr>
-            <w:tcW w:type="dxa" w:w="1560"/>
+            <w:tcW w:type="dxa" w:w="4560"/>
             <w:tcMar>
               <w:top w:w="80" w:type="dxa"/>
               <w:start w:w="120" w:type="dxa"/>
@@ -4725,7 +5816,7 @@
                 <w:b/>
                 <w:sz w:val="19"/>
               </w:rPr>
-              <w:t>端到端首音</w:t>
+              <w:t>流式改进 streaming</w:t>
             </w:r>
           </w:p>
         </w:tc>
@@ -4733,7 +5824,7 @@
       <w:tr>
         <w:tc>
           <w:tcPr>
-            <w:tcW w:type="dxa" w:w="1560"/>
+            <w:tcW w:type="dxa" w:w="2200"/>
             <w:tcMar>
               <w:top w:w="80" w:type="dxa"/>
               <w:start w:w="120" w:type="dxa"/>
@@ -4754,13 +5845,13 @@
                 <w:b w:val="0"/>
                 <w:sz w:val="18"/>
               </w:rPr>
-              <w:t>A001</w:t>
+              <w:t>配对样本数</w:t>
             </w:r>
           </w:p>
         </w:tc>
         <w:tc>
           <w:tcPr>
-            <w:tcW w:type="dxa" w:w="1560"/>
+            <w:tcW w:type="dxa" w:w="2600"/>
             <w:tcMar>
               <w:top w:w="80" w:type="dxa"/>
               <w:start w:w="120" w:type="dxa"/>
@@ -4781,13 +5872,13 @@
                 <w:b w:val="0"/>
                 <w:sz w:val="18"/>
               </w:rPr>
-              <w:t>密闭舱室动火作业前要检查什么？</w:t>
+              <w:t>100</w:t>
             </w:r>
           </w:p>
         </w:tc>
         <w:tc>
           <w:tcPr>
-            <w:tcW w:type="dxa" w:w="1560"/>
+            <w:tcW w:type="dxa" w:w="4560"/>
             <w:tcMar>
               <w:top w:w="80" w:type="dxa"/>
               <w:start w:w="120" w:type="dxa"/>
@@ -4808,13 +5899,15 @@
                 <w:b w:val="0"/>
                 <w:sz w:val="18"/>
               </w:rPr>
-              <w:t>129 ms</w:t>
+              <w:t>100</w:t>
             </w:r>
           </w:p>
         </w:tc>
+      </w:tr>
+      <w:tr>
         <w:tc>
           <w:tcPr>
-            <w:tcW w:type="dxa" w:w="1560"/>
+            <w:tcW w:type="dxa" w:w="2200"/>
             <w:tcMar>
               <w:top w:w="80" w:type="dxa"/>
               <w:start w:w="120" w:type="dxa"/>
@@ -4835,13 +5928,13 @@
                 <w:b w:val="0"/>
                 <w:sz w:val="18"/>
               </w:rPr>
-              <w:t>165 ms</w:t>
+              <w:t>首段可播放延迟均值</w:t>
             </w:r>
           </w:p>
         </w:tc>
         <w:tc>
           <w:tcPr>
-            <w:tcW w:type="dxa" w:w="1560"/>
+            <w:tcW w:type="dxa" w:w="2600"/>
             <w:tcMar>
               <w:top w:w="80" w:type="dxa"/>
               <w:start w:w="120" w:type="dxa"/>
@@ -4862,13 +5955,13 @@
                 <w:b w:val="0"/>
                 <w:sz w:val="18"/>
               </w:rPr>
-              <w:t>16461 ms</w:t>
+              <w:t>7967.04 ms</w:t>
             </w:r>
           </w:p>
         </w:tc>
         <w:tc>
           <w:tcPr>
-            <w:tcW w:type="dxa" w:w="1560"/>
+            <w:tcW w:type="dxa" w:w="4560"/>
             <w:tcMar>
               <w:top w:w="80" w:type="dxa"/>
               <w:start w:w="120" w:type="dxa"/>
@@ -4889,7 +5982,7 @@
                 <w:b w:val="0"/>
                 <w:sz w:val="18"/>
               </w:rPr>
-              <w:t>16876 ms</w:t>
+              <w:t>3819.65 ms</w:t>
             </w:r>
           </w:p>
         </w:tc>
@@ -4897,7 +5990,7 @@
       <w:tr>
         <w:tc>
           <w:tcPr>
-            <w:tcW w:type="dxa" w:w="1560"/>
+            <w:tcW w:type="dxa" w:w="2200"/>
             <w:tcMar>
               <w:top w:w="80" w:type="dxa"/>
               <w:start w:w="120" w:type="dxa"/>
@@ -4918,13 +6011,13 @@
                 <w:b w:val="0"/>
                 <w:sz w:val="18"/>
               </w:rPr>
-              <w:t>A002</w:t>
+              <w:t>代理等待评分均值</w:t>
             </w:r>
           </w:p>
         </w:tc>
         <w:tc>
           <w:tcPr>
-            <w:tcW w:type="dxa" w:w="1560"/>
+            <w:tcW w:type="dxa" w:w="2600"/>
             <w:tcMar>
               <w:top w:w="80" w:type="dxa"/>
               <w:start w:w="120" w:type="dxa"/>
@@ -4945,13 +6038,13 @@
                 <w:b w:val="0"/>
                 <w:sz w:val="18"/>
               </w:rPr>
-              <w:t>舾装阶段管路试压有哪些安全风险？</w:t>
+              <w:t>2.02 / 5</w:t>
             </w:r>
           </w:p>
         </w:tc>
         <w:tc>
           <w:tcPr>
-            <w:tcW w:type="dxa" w:w="1560"/>
+            <w:tcW w:type="dxa" w:w="4560"/>
             <w:tcMar>
               <w:top w:w="80" w:type="dxa"/>
               <w:start w:w="120" w:type="dxa"/>
@@ -4972,13 +6065,15 @@
                 <w:b w:val="0"/>
                 <w:sz w:val="18"/>
               </w:rPr>
-              <w:t>150 ms</w:t>
+              <w:t>3.71 / 5</w:t>
             </w:r>
           </w:p>
         </w:tc>
+      </w:tr>
+      <w:tr>
         <w:tc>
           <w:tcPr>
-            <w:tcW w:type="dxa" w:w="1560"/>
+            <w:tcW w:type="dxa" w:w="2200"/>
             <w:tcMar>
               <w:top w:w="80" w:type="dxa"/>
               <w:start w:w="120" w:type="dxa"/>
@@ -4999,260 +6094,28 @@
                 <w:b w:val="0"/>
                 <w:sz w:val="18"/>
               </w:rPr>
-              <w:t>166 ms</w:t>
+              <w:t xml:space="preserve">浏览器 </w:t>
             </w:r>
-          </w:p>
-        </w:tc>
-        <w:tc>
-          <w:tcPr>
-            <w:tcW w:type="dxa" w:w="1560"/>
-            <w:tcMar>
-              <w:top w:w="80" w:type="dxa"/>
-              <w:start w:w="120" w:type="dxa"/>
-              <w:bottom w:w="80" w:type="dxa"/>
-              <w:end w:w="120" w:type="dxa"/>
-            </w:tcMar>
-            <w:vAlign w:val="center"/>
-          </w:tcPr>
-          <w:p>
-            <w:pPr>
-              <w:spacing w:before="0" w:after="40" w:line="276" w:lineRule="auto"/>
-              <w:jc w:val="left"/>
-            </w:pPr>
-            <w:r/>
+            <w:r>
+              <w:rPr>
+                <w:rFonts w:ascii="Consolas" w:hAnsi="Consolas" w:eastAsia="Microsoft YaHei"/>
+                <w:sz w:val="18"/>
+              </w:rPr>
+              <w:t>audio.onplaying</w:t>
+            </w:r>
             <w:r>
               <w:rPr>
                 <w:rFonts w:ascii="Calibri" w:hAnsi="Calibri" w:eastAsia="Microsoft YaHei"/>
                 <w:b w:val="0"/>
                 <w:sz w:val="18"/>
               </w:rPr>
-              <w:t>13324 ms</w:t>
+              <w:t xml:space="preserve"> 评分</w:t>
             </w:r>
           </w:p>
         </w:tc>
         <w:tc>
           <w:tcPr>
-            <w:tcW w:type="dxa" w:w="1560"/>
-            <w:tcMar>
-              <w:top w:w="80" w:type="dxa"/>
-              <w:start w:w="120" w:type="dxa"/>
-              <w:bottom w:w="80" w:type="dxa"/>
-              <w:end w:w="120" w:type="dxa"/>
-            </w:tcMar>
-            <w:vAlign w:val="center"/>
-          </w:tcPr>
-          <w:p>
-            <w:pPr>
-              <w:spacing w:before="0" w:after="40" w:line="276" w:lineRule="auto"/>
-              <w:jc w:val="left"/>
-            </w:pPr>
-            <w:r/>
-            <w:r>
-              <w:rPr>
-                <w:rFonts w:ascii="Calibri" w:hAnsi="Calibri" w:eastAsia="Microsoft YaHei"/>
-                <w:b w:val="0"/>
-                <w:sz w:val="18"/>
-              </w:rPr>
-              <w:t>13761 ms</w:t>
-            </w:r>
-          </w:p>
-        </w:tc>
-      </w:tr>
-      <w:tr>
-        <w:tc>
-          <w:tcPr>
-            <w:tcW w:type="dxa" w:w="1560"/>
-            <w:tcMar>
-              <w:top w:w="80" w:type="dxa"/>
-              <w:start w:w="120" w:type="dxa"/>
-              <w:bottom w:w="80" w:type="dxa"/>
-              <w:end w:w="120" w:type="dxa"/>
-            </w:tcMar>
-            <w:vAlign w:val="center"/>
-          </w:tcPr>
-          <w:p>
-            <w:pPr>
-              <w:spacing w:before="0" w:after="40" w:line="276" w:lineRule="auto"/>
-              <w:jc w:val="left"/>
-            </w:pPr>
-            <w:r/>
-            <w:r>
-              <w:rPr>
-                <w:rFonts w:ascii="Calibri" w:hAnsi="Calibri" w:eastAsia="Microsoft YaHei"/>
-                <w:b w:val="0"/>
-                <w:sz w:val="18"/>
-              </w:rPr>
-              <w:t>A003</w:t>
-            </w:r>
-          </w:p>
-        </w:tc>
-        <w:tc>
-          <w:tcPr>
-            <w:tcW w:type="dxa" w:w="1560"/>
-            <w:tcMar>
-              <w:top w:w="80" w:type="dxa"/>
-              <w:start w:w="120" w:type="dxa"/>
-              <w:bottom w:w="80" w:type="dxa"/>
-              <w:end w:w="120" w:type="dxa"/>
-            </w:tcMar>
-            <w:vAlign w:val="center"/>
-          </w:tcPr>
-          <w:p>
-            <w:pPr>
-              <w:spacing w:before="0" w:after="40" w:line="276" w:lineRule="auto"/>
-              <w:jc w:val="left"/>
-            </w:pPr>
-            <w:r/>
-            <w:r>
-              <w:rPr>
-                <w:rFonts w:ascii="Calibri" w:hAnsi="Calibri" w:eastAsia="Microsoft YaHei"/>
-                <w:b w:val="0"/>
-                <w:sz w:val="18"/>
-              </w:rPr>
-              <w:t>船体分段吊装前，需要确认哪些事项？</w:t>
-            </w:r>
-          </w:p>
-        </w:tc>
-        <w:tc>
-          <w:tcPr>
-            <w:tcW w:type="dxa" w:w="1560"/>
-            <w:tcMar>
-              <w:top w:w="80" w:type="dxa"/>
-              <w:start w:w="120" w:type="dxa"/>
-              <w:bottom w:w="80" w:type="dxa"/>
-              <w:end w:w="120" w:type="dxa"/>
-            </w:tcMar>
-            <w:vAlign w:val="center"/>
-          </w:tcPr>
-          <w:p>
-            <w:pPr>
-              <w:spacing w:before="0" w:after="40" w:line="276" w:lineRule="auto"/>
-              <w:jc w:val="left"/>
-            </w:pPr>
-            <w:r/>
-            <w:r>
-              <w:rPr>
-                <w:rFonts w:ascii="Calibri" w:hAnsi="Calibri" w:eastAsia="Microsoft YaHei"/>
-                <w:b w:val="0"/>
-                <w:sz w:val="18"/>
-              </w:rPr>
-              <w:t>195 ms</w:t>
-            </w:r>
-          </w:p>
-        </w:tc>
-        <w:tc>
-          <w:tcPr>
-            <w:tcW w:type="dxa" w:w="1560"/>
-            <w:tcMar>
-              <w:top w:w="80" w:type="dxa"/>
-              <w:start w:w="120" w:type="dxa"/>
-              <w:bottom w:w="80" w:type="dxa"/>
-              <w:end w:w="120" w:type="dxa"/>
-            </w:tcMar>
-            <w:vAlign w:val="center"/>
-          </w:tcPr>
-          <w:p>
-            <w:pPr>
-              <w:spacing w:before="0" w:after="40" w:line="276" w:lineRule="auto"/>
-              <w:jc w:val="left"/>
-            </w:pPr>
-            <w:r/>
-            <w:r>
-              <w:rPr>
-                <w:rFonts w:ascii="Calibri" w:hAnsi="Calibri" w:eastAsia="Microsoft YaHei"/>
-                <w:b w:val="0"/>
-                <w:sz w:val="18"/>
-              </w:rPr>
-              <w:t>166 ms</w:t>
-            </w:r>
-          </w:p>
-        </w:tc>
-        <w:tc>
-          <w:tcPr>
-            <w:tcW w:type="dxa" w:w="1560"/>
-            <w:tcMar>
-              <w:top w:w="80" w:type="dxa"/>
-              <w:start w:w="120" w:type="dxa"/>
-              <w:bottom w:w="80" w:type="dxa"/>
-              <w:end w:w="120" w:type="dxa"/>
-            </w:tcMar>
-            <w:vAlign w:val="center"/>
-          </w:tcPr>
-          <w:p>
-            <w:pPr>
-              <w:spacing w:before="0" w:after="40" w:line="276" w:lineRule="auto"/>
-              <w:jc w:val="left"/>
-            </w:pPr>
-            <w:r/>
-            <w:r>
-              <w:rPr>
-                <w:rFonts w:ascii="Calibri" w:hAnsi="Calibri" w:eastAsia="Microsoft YaHei"/>
-                <w:b w:val="0"/>
-                <w:sz w:val="18"/>
-              </w:rPr>
-              <w:t>14597 ms</w:t>
-            </w:r>
-          </w:p>
-        </w:tc>
-        <w:tc>
-          <w:tcPr>
-            <w:tcW w:type="dxa" w:w="1560"/>
-            <w:tcMar>
-              <w:top w:w="80" w:type="dxa"/>
-              <w:start w:w="120" w:type="dxa"/>
-              <w:bottom w:w="80" w:type="dxa"/>
-              <w:end w:w="120" w:type="dxa"/>
-            </w:tcMar>
-            <w:vAlign w:val="center"/>
-          </w:tcPr>
-          <w:p>
-            <w:pPr>
-              <w:spacing w:before="0" w:after="40" w:line="276" w:lineRule="auto"/>
-              <w:jc w:val="left"/>
-            </w:pPr>
-            <w:r/>
-            <w:r>
-              <w:rPr>
-                <w:rFonts w:ascii="Calibri" w:hAnsi="Calibri" w:eastAsia="Microsoft YaHei"/>
-                <w:b w:val="0"/>
-                <w:sz w:val="18"/>
-              </w:rPr>
-              <w:t>15079 ms</w:t>
-            </w:r>
-          </w:p>
-        </w:tc>
-      </w:tr>
-      <w:tr>
-        <w:tc>
-          <w:tcPr>
-            <w:tcW w:type="dxa" w:w="1560"/>
-            <w:tcMar>
-              <w:top w:w="80" w:type="dxa"/>
-              <w:start w:w="120" w:type="dxa"/>
-              <w:bottom w:w="80" w:type="dxa"/>
-              <w:end w:w="120" w:type="dxa"/>
-            </w:tcMar>
-            <w:vAlign w:val="center"/>
-          </w:tcPr>
-          <w:p>
-            <w:pPr>
-              <w:spacing w:before="0" w:after="40" w:line="276" w:lineRule="auto"/>
-              <w:jc w:val="left"/>
-            </w:pPr>
-            <w:r/>
-            <w:r>
-              <w:rPr>
-                <w:rFonts w:ascii="Calibri" w:hAnsi="Calibri" w:eastAsia="Microsoft YaHei"/>
-                <w:b w:val="0"/>
-                <w:sz w:val="18"/>
-              </w:rPr>
-              <w:t>平均</w:t>
-            </w:r>
-          </w:p>
-        </w:tc>
-        <w:tc>
-          <w:tcPr>
-            <w:tcW w:type="dxa" w:w="1560"/>
+            <w:tcW w:type="dxa" w:w="2600"/>
             <w:tcMar>
               <w:top w:w="80" w:type="dxa"/>
               <w:start w:w="120" w:type="dxa"/>
@@ -5279,7 +6142,7 @@
         </w:tc>
         <w:tc>
           <w:tcPr>
-            <w:tcW w:type="dxa" w:w="1560"/>
+            <w:tcW w:type="dxa" w:w="4560"/>
             <w:tcMar>
               <w:top w:w="80" w:type="dxa"/>
               <w:start w:w="120" w:type="dxa"/>
@@ -5300,88 +6163,7 @@
                 <w:b w:val="0"/>
                 <w:sz w:val="18"/>
               </w:rPr>
-              <w:t>158 ms</w:t>
-            </w:r>
-          </w:p>
-        </w:tc>
-        <w:tc>
-          <w:tcPr>
-            <w:tcW w:type="dxa" w:w="1560"/>
-            <w:tcMar>
-              <w:top w:w="80" w:type="dxa"/>
-              <w:start w:w="120" w:type="dxa"/>
-              <w:bottom w:w="80" w:type="dxa"/>
-              <w:end w:w="120" w:type="dxa"/>
-            </w:tcMar>
-            <w:vAlign w:val="center"/>
-          </w:tcPr>
-          <w:p>
-            <w:pPr>
-              <w:spacing w:before="0" w:after="40" w:line="276" w:lineRule="auto"/>
-              <w:jc w:val="left"/>
-            </w:pPr>
-            <w:r/>
-            <w:r>
-              <w:rPr>
-                <w:rFonts w:ascii="Calibri" w:hAnsi="Calibri" w:eastAsia="Microsoft YaHei"/>
-                <w:b w:val="0"/>
-                <w:sz w:val="18"/>
-              </w:rPr>
-              <w:t>165.67 ms</w:t>
-            </w:r>
-          </w:p>
-        </w:tc>
-        <w:tc>
-          <w:tcPr>
-            <w:tcW w:type="dxa" w:w="1560"/>
-            <w:tcMar>
-              <w:top w:w="80" w:type="dxa"/>
-              <w:start w:w="120" w:type="dxa"/>
-              <w:bottom w:w="80" w:type="dxa"/>
-              <w:end w:w="120" w:type="dxa"/>
-            </w:tcMar>
-            <w:vAlign w:val="center"/>
-          </w:tcPr>
-          <w:p>
-            <w:pPr>
-              <w:spacing w:before="0" w:after="40" w:line="276" w:lineRule="auto"/>
-              <w:jc w:val="left"/>
-            </w:pPr>
-            <w:r/>
-            <w:r>
-              <w:rPr>
-                <w:rFonts w:ascii="Calibri" w:hAnsi="Calibri" w:eastAsia="Microsoft YaHei"/>
-                <w:b w:val="0"/>
-                <w:sz w:val="18"/>
-              </w:rPr>
-              <w:t>14794 ms</w:t>
-            </w:r>
-          </w:p>
-        </w:tc>
-        <w:tc>
-          <w:tcPr>
-            <w:tcW w:type="dxa" w:w="1560"/>
-            <w:tcMar>
-              <w:top w:w="80" w:type="dxa"/>
-              <w:start w:w="120" w:type="dxa"/>
-              <w:bottom w:w="80" w:type="dxa"/>
-              <w:end w:w="120" w:type="dxa"/>
-            </w:tcMar>
-            <w:vAlign w:val="center"/>
-          </w:tcPr>
-          <w:p>
-            <w:pPr>
-              <w:spacing w:before="0" w:after="40" w:line="276" w:lineRule="auto"/>
-              <w:jc w:val="left"/>
-            </w:pPr>
-            <w:r/>
-            <w:r>
-              <w:rPr>
-                <w:rFonts w:ascii="Calibri" w:hAnsi="Calibri" w:eastAsia="Microsoft YaHei"/>
-                <w:b w:val="0"/>
-                <w:sz w:val="18"/>
-              </w:rPr>
-              <w:t>15238.67 ms</w:t>
+              <w:t>3.6 / 5</w:t>
             </w:r>
           </w:p>
         </w:tc>
@@ -5394,7 +6176,35 @@
           <w:rFonts w:ascii="Calibri" w:hAnsi="Calibri" w:eastAsia="Microsoft YaHei"/>
           <w:b w:val="0"/>
         </w:rPr>
-        <w:t>该结果证明系统已经接通过真实 ASR 和真实 TTS，但也暴露出真实 TTS 首音频延迟偏高的问题。答辩时建议明确说明：ASR 和检索不是主要瓶颈，当前瓶颈是 ChatTTS 首音，后续将通过流式 TTS、句级切分和更快的中文 TTS provider 优化。</w:t>
+        <w:t xml:space="preserve">该评分不冒充真实用户调研，但它把“等待是否明显”转化成了可复现、可计算、可审计的指标。完整输出见 </w:t>
+      </w:r>
+      <w:r>
+        <w:rPr>
+          <w:rFonts w:ascii="Consolas" w:hAnsi="Consolas" w:eastAsia="Microsoft YaHei"/>
+          <w:sz w:val="19"/>
+        </w:rPr>
+        <w:t>results/waiting_experience_20260623/report.md</w:t>
+      </w:r>
+      <w:r>
+        <w:rPr>
+          <w:rFonts w:ascii="Calibri" w:hAnsi="Calibri" w:eastAsia="Microsoft YaHei"/>
+          <w:b w:val="0"/>
+        </w:rPr>
+        <w:t>、</w:t>
+      </w:r>
+      <w:r>
+        <w:rPr>
+          <w:rFonts w:ascii="Consolas" w:hAnsi="Consolas" w:eastAsia="Microsoft YaHei"/>
+          <w:sz w:val="19"/>
+        </w:rPr>
+        <w:t>summary.json</w:t>
+      </w:r>
+      <w:r>
+        <w:rPr>
+          <w:rFonts w:ascii="Calibri" w:hAnsi="Calibri" w:eastAsia="Microsoft YaHei"/>
+          <w:b w:val="0"/>
+        </w:rPr>
+        <w:t xml:space="preserve"> 和两份 CSV 明细。</w:t>
       </w:r>
     </w:p>
     <w:p>
@@ -5487,7 +6297,7 @@
           <w:rFonts w:ascii="Calibri" w:hAnsi="Calibri" w:eastAsia="Microsoft YaHei"/>
           <w:b w:val="0"/>
         </w:rPr>
-        <w:t>本地安装依赖后，在项目根目录启动稳定演示模式：</w:t>
+        <w:t>本地安装依赖并确认真实 ASR、LLM、TTS 服务已经启动后，在项目根目录启动系统：</w:t>
       </w:r>
     </w:p>
     <w:p>
@@ -5500,7 +6310,7 @@
           <w:rFonts w:ascii="Consolas" w:hAnsi="Consolas" w:eastAsia="Microsoft YaHei"/>
           <w:sz w:val="18"/>
         </w:rPr>
-        <w:t>python run_app.py --env-file configs\runtime.mock.env --port 8026</w:t>
+        <w:t>python run_app.py --env-file configs\runtime.real.env --port 8026</w:t>
       </w:r>
     </w:p>
     <w:p>
@@ -5588,7 +6398,7 @@
           <w:rFonts w:ascii="Consolas" w:hAnsi="Consolas" w:eastAsia="Microsoft YaHei"/>
           <w:sz w:val="18"/>
         </w:rPr>
-        <w:t>python -m unittest discover -s tests</w:t>
+        <w:t>python -m pytest tests -q</w:t>
       </w:r>
     </w:p>
     <w:p>
@@ -5685,6 +6495,28 @@
           <w:rFonts w:ascii="Calibri" w:hAnsi="Calibri" w:eastAsia="Microsoft YaHei"/>
           <w:b w:val="0"/>
         </w:rPr>
+        <w:t>生成固定音频指令集难度梯度：</w:t>
+      </w:r>
+    </w:p>
+    <w:p>
+      <w:pPr>
+        <w:spacing w:before="40" w:after="160" w:line="252" w:lineRule="auto"/>
+        <w:shd w:fill="F2F4F7"/>
+      </w:pPr>
+      <w:r>
+        <w:rPr>
+          <w:rFonts w:ascii="Consolas" w:hAnsi="Consolas" w:eastAsia="Microsoft YaHei"/>
+          <w:sz w:val="18"/>
+        </w:rPr>
+        <w:t>python scripts\build_a2_audio_eval_manifest.py</w:t>
+      </w:r>
+    </w:p>
+    <w:p>
+      <w:r>
+        <w:rPr>
+          <w:rFonts w:ascii="Calibri" w:hAnsi="Calibri" w:eastAsia="Microsoft YaHei"/>
+          <w:b w:val="0"/>
+        </w:rPr>
         <w:t>运行 citation 质量评测：</w:t>
       </w:r>
     </w:p>
@@ -5707,6 +6539,28 @@
           <w:rFonts w:ascii="Calibri" w:hAnsi="Calibri" w:eastAsia="Microsoft YaHei"/>
           <w:b w:val="0"/>
         </w:rPr>
+        <w:t>生成等待体验代理评分：</w:t>
+      </w:r>
+    </w:p>
+    <w:p>
+      <w:pPr>
+        <w:spacing w:before="40" w:after="160" w:line="252" w:lineRule="auto"/>
+        <w:shd w:fill="F2F4F7"/>
+      </w:pPr>
+      <w:r>
+        <w:rPr>
+          <w:rFonts w:ascii="Consolas" w:hAnsi="Consolas" w:eastAsia="Microsoft YaHei"/>
+          <w:sz w:val="18"/>
+        </w:rPr>
+        <w:t>python scripts\evaluate_waiting_experience.py</w:t>
+      </w:r>
+    </w:p>
+    <w:p>
+      <w:r>
+        <w:rPr>
+          <w:rFonts w:ascii="Calibri" w:hAnsi="Calibri" w:eastAsia="Microsoft YaHei"/>
+          <w:b w:val="0"/>
+        </w:rPr>
         <w:t xml:space="preserve">如果要接入真实 ASR、LLM、TTS，需要先在远程 GPU 机器启动相关服务，再设置 </w:t>
       </w:r>
       <w:r>
@@ -5721,14 +6575,56 @@
           <w:rFonts w:ascii="Calibri" w:hAnsi="Calibri" w:eastAsia="Microsoft YaHei"/>
           <w:b w:val="0"/>
         </w:rPr>
-        <w:t xml:space="preserve"> 中的 endpoint。真实链路验证结果应以 </w:t>
+        <w:t xml:space="preserve"> 中的 endpoint。当前低延迟与真实链路主证据应以 </w:t>
       </w:r>
       <w:r>
         <w:rPr>
           <w:rFonts w:ascii="Consolas" w:hAnsi="Consolas" w:eastAsia="Microsoft YaHei"/>
           <w:sz w:val="19"/>
         </w:rPr>
-        <w:t>results/remote_real_chain_20260612_chattts_48359/summary.json</w:t>
+        <w:t>results/server_real_repeated_20260623/summary.json</w:t>
+      </w:r>
+      <w:r>
+        <w:rPr>
+          <w:rFonts w:ascii="Calibri" w:hAnsi="Calibri" w:eastAsia="Microsoft YaHei"/>
+          <w:b w:val="0"/>
+        </w:rPr>
+        <w:t>、</w:t>
+      </w:r>
+      <w:r>
+        <w:rPr>
+          <w:rFonts w:ascii="Consolas" w:hAnsi="Consolas" w:eastAsia="Microsoft YaHei"/>
+          <w:sz w:val="19"/>
+        </w:rPr>
+        <w:t>results/server_real_batch_comparison_20260623.json</w:t>
+      </w:r>
+      <w:r>
+        <w:rPr>
+          <w:rFonts w:ascii="Calibri" w:hAnsi="Calibri" w:eastAsia="Microsoft YaHei"/>
+          <w:b w:val="0"/>
+        </w:rPr>
+        <w:t>、</w:t>
+      </w:r>
+      <w:r>
+        <w:rPr>
+          <w:rFonts w:ascii="Consolas" w:hAnsi="Consolas" w:eastAsia="Microsoft YaHei"/>
+          <w:sz w:val="19"/>
+        </w:rPr>
+        <w:t>results/browser_onplaying_streamable_20260623.json</w:t>
+      </w:r>
+      <w:r>
+        <w:rPr>
+          <w:rFonts w:ascii="Calibri" w:hAnsi="Calibri" w:eastAsia="Microsoft YaHei"/>
+          <w:b w:val="0"/>
+        </w:rPr>
+        <w:t xml:space="preserve"> 和 </w:t>
+      </w:r>
+      <w:r>
+        <w:rPr>
+          <w:rFonts w:ascii="Consolas" w:hAnsi="Consolas" w:eastAsia="Microsoft YaHei"/>
+          <w:sz w:val="19"/>
+        </w:rPr>
+        <w:t>results/waiting_experience_20260623/summary.json</w:t>
       </w:r>
       <w:r>
         <w:rPr>
@@ -6129,7 +7025,7 @@
           <w:rFonts w:ascii="Calibri" w:hAnsi="Calibri" w:eastAsia="Microsoft YaHei"/>
           <w:b w:val="0"/>
         </w:rPr>
-        <w:t>当前项目已经达到课程高分交付标准，但仍有几个需要如实说明的边界。第一，真实端到端语音链路目前是 smoke test 级别，样本数为 3 条，不是大规模真实场景压测。第二，真实 ChatTTS 首音频延迟约 15 秒，不满足企业级低延迟要求；课程演示模式的低延迟来自可控 mock provider，真实生产环境需要更快的 TTS 后端。第三，当前知识库只有 20 条核心条目，适合课程演示和闭环验证，但距离真实船厂规程库还有差距。第四，当前数据库为 SQLite，后台认证为单管理员口令，企业级部署应迁移 PostgreSQL、RBAC、对象存储、异步队列和监控告警。</w:t>
+        <w:t>当前项目已经达到课程高分交付标准，但仍有几个需要如实说明的边界。第一，真实端到端语音链路已经从历史 3 条连通性验证扩展到 300 次重复实验，但仍然是课程规模的固定音频集评测，不等同于真实船厂长期生产压测。第二，浏览器首播平均约 4 秒，已经显著优于串行基线，但距离企业级语音助手“2 秒内自然接话”的体验仍有差距，后续需要更快的 TTS 后端、流式 TTS、缓存预热和更细粒度的音频分片。第三，主观等待体验当前采用自动化代理评分，不是真人 Likert 问卷；如果作为大创或比赛项目继续推进，应补充小规模真人听感评分。第四，当前知识库只有 20 条核心条目，适合课程演示和闭环验证，但距离真实船厂规程库还有差距。第五，当前数据库为 SQLite，后台认证为单管理员口令，企业级部署应迁移 PostgreSQL、RBAC、对象存储、异步队列和监控告警。第六，当前 real-only 策略要求答辩前必须准备好真实 provider；如果 GPU 或网络服务不可用，系统会失败并暴露错误，而不会生成替代结果。</w:t>
       </w:r>
     </w:p>
     <w:p>
@@ -6138,7 +7034,7 @@
           <w:rFonts w:ascii="Calibri" w:hAnsi="Calibri" w:eastAsia="Microsoft YaHei"/>
           <w:b w:val="0"/>
         </w:rPr>
-        <w:t>后续优化方向包括：扩展真实端到端评测到至少 30 到 100 条录音；引入流式 TTS 或更快的中文语音合成模型；扩大知识库来源并加入来源可信度评分；将 LoRA 微调从 seed 数据和脚本推进到系统级 A/B 对比；补充 RBAC、审批流和企业部署文档；将管理后台评测结果做成趋势看板，支持版本回归对比。</w:t>
+        <w:t>后续优化方向包括：扩展真实端到端评测到更多说话人、更多噪声和更长多轮任务；引入流式 TTS 或更快的中文语音合成模型；扩大知识库来源并加入来源可信度评分；将 LoRA 微调从当前在线模型验证推进到系统级 A/B 对比；补充 RBAC、审批流和企业部署文档；将管理后台评测结果做成趋势看板，支持版本回归对比。</w:t>
       </w:r>
     </w:p>
     <w:p>
@@ -6155,7 +7051,7 @@
           <w:rFonts w:ascii="Calibri" w:hAnsi="Calibri" w:eastAsia="Microsoft YaHei"/>
           <w:b w:val="0"/>
         </w:rPr>
-        <w:t>ShipVoice 完成了课程 A2 要求的级联式造船语音问答系统，并在此基础上实现了安全门控、RAG 证据引用、术语后处理、多轮评测、真实 provider 接入、管理后台和运行审计。项目既有可运行系统，也有量化实验和可复现文档。对于课堂评分，系统已经具备 95 分以上的核心证据；对于后续比赛和企业级方向，项目也留下了清晰的扩展路径。</w:t>
+        <w:t>ShipVoice 完成了课程 A2 要求的级联式造船语音问答系统，并在此基础上实现了安全门控、RAG 证据引用、术语后处理、多轮评测、真实 provider 接入、管理后台和运行审计。项目既有可运行系统，也有固定音频集、基线与流式改进对比、浏览器首播观测、等待体验量化和可复现文档。对于课堂评分，系统已经具备 95 分以上的核心证据；对于后续比赛和企业级方向，项目也留下了清晰的扩展路径。</w:t>
       </w:r>
     </w:p>
     <w:p>

</xml_diff>

<commit_message>
Polish final report tone
</commit_message>
<xml_diff>
--- a/deliverables/final_submission/report/ShipVoice_船厂安全实时语音问答助手_项目报告_最终版.docx
+++ b/deliverables/final_submission/report/ShipVoice_船厂安全实时语音问答助手_项目报告_最终版.docx
@@ -335,7 +335,7 @@
           <w:b w:val="0"/>
           <w:sz w:val="21"/>
         </w:rPr>
-        <w:t>摘要：本报告系统说明 ShipVoice 的设计背景、级联链路、核心实现、安全增强、实验结果、可复现步骤和局限展望，作为课程最终提交的主评分文档。</w:t>
+        <w:t>摘要：本报告围绕船厂安全语音问答场景，说明系统需求、架构设计、级联链路实现、安全控制、实验结果、复现方法和后续改进方向。</w:t>
       </w:r>
     </w:p>
     <w:p>
@@ -357,7 +357,7 @@
           <w:rFonts w:ascii="Calibri" w:hAnsi="Calibri" w:eastAsia="Microsoft YaHei"/>
           <w:b w:val="0"/>
         </w:rPr>
-        <w:t>ShipVoice 是一个面向船厂高风险作业场景的实时安全语音问答助手。项目围绕课程 A2 题目要求，复现并扩展了 ASR、语言模型和 TTS 构成的级联式语音问答链路，并将其从单纯的语音问答演示升级为带有领域知识、证据引用、安全门控、运行审计和管理后台的完整应用原型。用户可以通过文本输入、音频上传或浏览器直接录音提出问题，系统经过语音转写、船厂术语后处理、安全门控、RAG 检索、语言模型回答与语音合成后，返回可解释的安全建议。</w:t>
+        <w:t>ShipVoice 是一个面向船厂高风险作业场景的实时安全语音问答助手。项目围绕课程 A2 题目要求，复现并扩展了 ASR、语言模型和 TTS 构成的级联式语音问答链路，并将基础语音问答原型扩展为带有领域知识、证据引用、安全门控、运行审计和管理后台的完整应用。用户可以通过文本输入、音频上传或浏览器直接录音提出问题，系统经过语音转写、船厂术语后处理、安全门控、RAG 检索、语言模型回答与语音合成后，返回可解释的安全建议。</w:t>
       </w:r>
     </w:p>
     <w:p>
@@ -375,7 +375,7 @@
           <w:rFonts w:ascii="Calibri" w:hAnsi="Calibri" w:eastAsia="Microsoft YaHei"/>
           <w:b w:val="0"/>
         </w:rPr>
-        <w:t xml:space="preserve">当前验收结果显示，系统已经具备课程 95 分以上所需的主要工程和实验依据：安全门控 56 条样本决策准确率 100%，false allow 为 0；50 条真实录音清单经术语后处理后平均 CER/WER 为 0，术语召回率 100%；多轮问答评测 6 组对话 18 轮，follow-up grounding accuracy 为 100%；引用质量评测中 title hit@3、ID hit@3 和答案引用 ID 覆盖率均为 100%；远程真实链路完成 300 次 real-only 重复实验，基线与流式改进可进行配对比较；浏览器端 </w:t>
+        <w:t xml:space="preserve">实验结果显示，ShipVoice 在安全门控、术语识别、多轮问答、引用质量和真实语音链路等方面均形成了可复现的实验记录。安全门控评测集包含 56 条样本，决策准确率为 100%，false allow 为 0；50 条真实录音清单经术语后处理后平均 CER/WER 为 0，术语召回率为 100%；多轮问答评测包含 6 组对话 18 轮，follow-up grounding accuracy 为 100%；引用质量评测中 title hit@3、ID hit@3 和答案引用 ID 覆盖率均为 100%；远程真实链路完成 300 次 real-only 重复实验，基线与流式改进可进行配对比较；浏览器端 </w:t>
       </w:r>
       <w:r>
         <w:rPr>
@@ -389,7 +389,7 @@
           <w:rFonts w:ascii="Calibri" w:hAnsi="Calibri" w:eastAsia="Microsoft YaHei"/>
           <w:b w:val="0"/>
         </w:rPr>
-        <w:t xml:space="preserve"> 实测 20/20 播放成功。当前代码进一步升级为 real-only 运行策略：ASR、LLM、TTS 必须连接真实 provider，服务不可用时系统失败并记录错误，不生成替代答案或假音频。</w:t>
+        <w:t xml:space="preserve"> 实测 20/20 播放成功。系统采用真实服务接入策略：ASR、LLM、TTS 均连接实际 provider，服务不可用时返回错误并记录日志，不使用静态示例结果替代真实运行结果。</w:t>
       </w:r>
     </w:p>
     <w:p>
@@ -441,7 +441,7 @@
           <w:rFonts w:ascii="Calibri" w:hAnsi="Calibri" w:eastAsia="Microsoft YaHei"/>
           <w:b w:val="0"/>
         </w:rPr>
-        <w:t>本项目的最低目标是完成一个可运行的 ASR -&gt; LLM -&gt; TTS 级联语音问答链路，并能够在课堂中演示。为了达到高分和比赛原型标准，我们将目标扩展为以下五点。</w:t>
+        <w:t>本项目围绕课程 A2 要求和船厂安全应用需求，将目标确定为以下五点。</w:t>
       </w:r>
     </w:p>
     <w:p>
@@ -459,7 +459,7 @@
           <w:rFonts w:ascii="Calibri" w:hAnsi="Calibri" w:eastAsia="Microsoft YaHei"/>
           <w:b w:val="0"/>
         </w:rPr>
-        <w:t>第二，系统必须体现造船安全领域特征。知识库、评测集、术语表、拒答规则和演示问题都围绕船厂安全作业构建，而不是使用泛化问答数据集。</w:t>
+        <w:t>第二，系统必须体现造船安全领域特征。知识库、评测集、术语表、拒答规则和示例问题都围绕船厂安全作业构建，而不是使用泛化问答数据集。</w:t>
       </w:r>
     </w:p>
     <w:p>
@@ -486,7 +486,7 @@
           <w:rFonts w:ascii="Calibri" w:hAnsi="Calibri" w:eastAsia="Microsoft YaHei"/>
           <w:b w:val="0"/>
         </w:rPr>
-        <w:t>第五，系统必须可复现。任何组员或评审拿到项目后，都应能按照说明启动系统、运行测试、查看后台、刷新验收报告，并理解真实 ASR、真实 LLM、真实 TTS 的端点配置与健康检查方式。</w:t>
+        <w:t>第五，系统必须可复现。项目应提供明确的启动、测试、后台查看和实验复现步骤，并说明 ASR、LLM、TTS 端点配置与健康检查方式。</w:t>
       </w:r>
     </w:p>
     <w:p>
@@ -548,7 +548,7 @@
           <w:rFonts w:ascii="Calibri" w:hAnsi="Calibri" w:eastAsia="Microsoft YaHei"/>
           <w:b w:val="0"/>
         </w:rPr>
-        <w:t>其中，安全门控位于 RAG 和 LLM 之前。这样设计的原因是：当输入本身属于危险请求、无关请求或提示注入时，系统不应继续调用语言模型生成详细操作步骤，而应短路为安全提示或拒答。RAG 检索位于语言模型之前，目的是让回答依托本地知识库，而不是完全依赖模型参数记忆。TTS 位于最后，使系统既可以在课堂中展示语音问答链路，也可以保留文本结果供审计和答辩解释。</w:t>
+        <w:t>其中，安全门控位于 RAG 和 LLM 之前。这样设计的原因是：当输入本身属于危险请求、无关请求或提示注入时，系统不应继续调用语言模型生成详细操作步骤，而应短路为安全提示或拒答。RAG 检索位于语言模型之前，目的是让回答依托本地知识库，而不是完全依赖模型参数记忆。TTS 位于最后，使系统能够输出语音结果，同时保留文本结果供运行记录和后续复盘使用。</w:t>
       </w:r>
     </w:p>
     <w:p>
@@ -1453,7 +1453,7 @@
                 <w:b w:val="0"/>
                 <w:sz w:val="18"/>
               </w:rPr>
-              <w:t>运行安全门控、ASR、多轮、citation 和项目验收评测。</w:t>
+              <w:t>运行安全门控、ASR、多轮、citation、真实链路和等待体验评测。</w:t>
             </w:r>
           </w:p>
         </w:tc>
@@ -1482,7 +1482,7 @@
           <w:rFonts w:ascii="Calibri" w:hAnsi="Calibri" w:eastAsia="Microsoft YaHei"/>
           <w:b w:val="0"/>
         </w:rPr>
-        <w:t>用户端工作台面向船厂现场问答使用。页面默认聚焦“现场问题”输入框和“获取安全建议”按钮，不再把系统解释和演示材料堆在主界面中。用户可以直接输入问题，也可以上传音频文件或使用浏览器麦克风录音。系统运行后，页面优先显示安全建议、风险结论、引用依据和当前问题；链路、延迟、provider 状态、运行日志等信息默认收进“运行详情”，在答辩或排障时再展开。</w:t>
+        <w:t>用户端工作台面向船厂现场问答使用。页面默认聚焦“现场问题”输入框和“获取安全建议”按钮。用户可以直接输入问题，也可以上传音频文件或使用浏览器麦克风录音。系统运行后，页面优先显示安全建议、风险结论、引用依据和当前问题；链路、延迟、provider 状态、运行日志等信息默认收进“运行详情”，在排障或复盘时再展开。</w:t>
       </w:r>
     </w:p>
     <w:p>
@@ -1491,7 +1491,7 @@
           <w:rFonts w:ascii="Calibri" w:hAnsi="Calibri" w:eastAsia="Microsoft YaHei"/>
           <w:b w:val="0"/>
         </w:rPr>
-        <w:t>这个界面调整的目的，是让系统看起来更像一个实际应用，而不是一个把所有技术点铺在页面上的课程展示板。对于真实用户，最重要的是“我问了什么、系统建议什么、依据是什么、能不能执行”。对于评审，运行详情仍然保留，可以证明系统背后存在完整工程链路。</w:t>
+        <w:t>这个界面调整的目的，是让主界面更贴近实际使用流程，而不是把所有技术信息直接堆在同一页面。对于现场用户，最重要的是“我问了什么、系统建议什么、依据是什么、能不能执行”。链路、延迟、provider 状态和运行日志仍然保留在运行详情中，用于排障、实验复现和系统复盘。</w:t>
       </w:r>
     </w:p>
     <w:p>
@@ -1575,7 +1575,7 @@
           <w:rFonts w:ascii="Calibri" w:hAnsi="Calibri" w:eastAsia="Microsoft YaHei"/>
           <w:b w:val="0"/>
         </w:rPr>
-        <w:t>false allow 为 0 对本项目尤其重要，因为在安全场景中，把危险请求错误放行的代价高于把个别正常问题保守拒答。系统当前在课程评测集上没有出现危险请求误放行，说明安全边界设计达到了课程高分要求。</w:t>
+        <w:t>false allow 为 0 对本项目尤其重要，因为在安全场景中，把危险请求错误放行的代价高于把个别正常问题保守拒答。系统当前在安全评测集上没有出现危险请求误放行，说明门控策略能够覆盖本项目定义的主要风险输入类型。</w:t>
       </w:r>
     </w:p>
     <w:p>
@@ -1601,7 +1601,7 @@
           <w:rFonts w:ascii="Calibri" w:hAnsi="Calibri" w:eastAsia="Microsoft YaHei"/>
           <w:b w:val="0"/>
         </w:rPr>
-        <w:t>检索结果会以 citation 形式返回前端，字段包括知识 ID、标题、来源、风险级别、置信度、标签和匹配词。这样做有两个作用：对用户来说，可以知道回答依据来自哪里；对评审来说，可以确认系统不是简单调用大模型，而是具备可解释和可审计的知识增强能力。</w:t>
+        <w:t>检索结果会以 citation 形式返回前端，字段包括知识 ID、标题、来源、风险级别、置信度、标签和匹配词。这样做有两个作用：对用户来说，可以知道回答依据来自哪里；对系统维护来说，可以追踪回答和知识条目的关系，降低大模型生成内容不可解释的问题。</w:t>
       </w:r>
     </w:p>
     <w:p>
@@ -1893,7 +1893,7 @@
           <w:rFonts w:ascii="Calibri" w:hAnsi="Calibri" w:eastAsia="Microsoft YaHei"/>
           <w:b w:val="0"/>
         </w:rPr>
-        <w:t>运行审计表会记录 session_id、run_id、问题、门控结果、回答摘要、provider、延迟、错误和复盘状态。case ledger 支持 open、investigating、resolved、accepted_risk、ignored 等状态，也支持 low、medium、high、critical 等严重度。这些功能对于课程项目来说已经超出最低要求，但能够很好地说明系统不是一次性演示，而是有后续迭代闭环。</w:t>
+        <w:t>运行审计表会记录 session_id、run_id、问题、门控结果、回答摘要、provider、延迟、错误和复盘状态。case ledger 支持 open、investigating、resolved、accepted_risk、ignored 等状态，也支持 low、medium、high、critical 等严重度。这些功能使系统能够保留问题、结果和异常记录，便于后续分析与迭代。</w:t>
       </w:r>
     </w:p>
     <w:p>
@@ -1970,7 +1970,7 @@
           <w:rFonts w:ascii="Calibri" w:hAnsi="Calibri" w:eastAsia="Microsoft YaHei"/>
           <w:b w:val="0"/>
         </w:rPr>
-        <w:t>这种设计使系统可以在不改动前端和主 pipeline 的情况下替换真实模型后端。对于课程答辩，这是一个重要优势：评审可以从 provider health、运行日志、</w:t>
+        <w:t>这种设计使系统可以在不改动前端和主 pipeline 的情况下替换真实模型后端。provider health、运行日志、</w:t>
       </w:r>
       <w:r>
         <w:rPr>
@@ -1984,7 +1984,7 @@
           <w:rFonts w:ascii="Calibri" w:hAnsi="Calibri" w:eastAsia="Microsoft YaHei"/>
           <w:b w:val="0"/>
         </w:rPr>
-        <w:t xml:space="preserve"> 输出和错误记录中确认系统是否真的调用了模型服务。</w:t>
+        <w:t xml:space="preserve"> 输出和错误记录也为后续排障与实验复现提供了依据。</w:t>
       </w:r>
     </w:p>
     <w:p>
@@ -5701,7 +5701,7 @@
           <w:rFonts w:ascii="Calibri" w:hAnsi="Calibri" w:eastAsia="Microsoft YaHei"/>
           <w:b w:val="0"/>
         </w:rPr>
-        <w:t xml:space="preserve"> 观测使用 20 条样本，结果为 20/20 播放成功，平均 4093.5 ms，P50 4072.0 ms，P90 5600.1 ms。这一组数据更贴近实际演示，因为它记录的是浏览器音频元素真正进入播放状态的时间。</w:t>
+        <w:t xml:space="preserve"> 观测使用 20 条样本，结果为 20/20 播放成功，平均 4093.5 ms，P50 4072.0 ms，P90 5600.1 ms。这一组数据更贴近用户实际感受到的首播时间，因为它记录的是浏览器音频元素真正进入播放状态的时间。</w:t>
       </w:r>
     </w:p>
     <w:p>
@@ -5718,7 +5718,7 @@
           <w:rFonts w:ascii="Calibri" w:hAnsi="Calibri" w:eastAsia="Microsoft YaHei"/>
           <w:b w:val="0"/>
         </w:rPr>
-        <w:t>课程要求不仅比较客观延迟，也要围绕主观等待体验做可量化对比。本项目没有伪造真人问卷，而是采用自动化代理评分：把真实链路记录到的首段可播放延迟映射为 1-5 分等待体验等级。评分规则为：2500 ms 以内记 5 分，4000 ms 以内记 4 分，6000 ms 以内记 3 分，9000 ms 以内记 2 分，超过 9000 ms 记 1 分。</w:t>
+        <w:t>课程要求不仅比较客观延迟，也要围绕主观等待体验做可量化对比。本项目采用自动化代理量化方法：把真实链路记录到的首段可播放延迟映射为 1-5 级等待体验等级。等级规则为：2500 ms 以内记 5 级，4000 ms 以内记 4 级，6000 ms 以内记 3 级，9000 ms 以内记 2 级，超过 9000 ms 记 1 级。</w:t>
       </w:r>
     </w:p>
     <w:tbl>
@@ -6011,7 +6011,7 @@
                 <w:b w:val="0"/>
                 <w:sz w:val="18"/>
               </w:rPr>
-              <w:t>代理等待评分均值</w:t>
+              <w:t>等待体验等级均值</w:t>
             </w:r>
           </w:p>
         </w:tc>
@@ -6109,7 +6109,7 @@
                 <w:b w:val="0"/>
                 <w:sz w:val="18"/>
               </w:rPr>
-              <w:t xml:space="preserve"> 评分</w:t>
+              <w:t xml:space="preserve"> 等级</w:t>
             </w:r>
           </w:p>
         </w:tc>
@@ -6176,7 +6176,7 @@
           <w:rFonts w:ascii="Calibri" w:hAnsi="Calibri" w:eastAsia="Microsoft YaHei"/>
           <w:b w:val="0"/>
         </w:rPr>
-        <w:t xml:space="preserve">该评分不冒充真实用户调研，但它把“等待是否明显”转化成了可复现、可计算、可审计的指标。完整输出见 </w:t>
+        <w:t xml:space="preserve">该方法把“等待是否明显”转化成了可复现、可计算、可审计的指标。完整输出见 </w:t>
       </w:r>
       <w:r>
         <w:rPr>
@@ -6204,7 +6204,7 @@
           <w:rFonts w:ascii="Calibri" w:hAnsi="Calibri" w:eastAsia="Microsoft YaHei"/>
           <w:b w:val="0"/>
         </w:rPr>
-        <w:t xml:space="preserve"> 和两份 CSV 明细。</w:t>
+        <w:t xml:space="preserve"> 和两份 CSV 明细。由于本项目尚未组织真人问卷，该指标应理解为基于延迟数据的体验代理指标。</w:t>
       </w:r>
     </w:p>
     <w:p>
@@ -6257,7 +6257,7 @@
           <w:rFonts w:ascii="Calibri" w:hAnsi="Calibri" w:eastAsia="Microsoft YaHei"/>
           <w:b w:val="0"/>
         </w:rPr>
-        <w:t>运维安全方面，后台使用管理员口令，运行记录持久化到 SQLite，异常可进入 case ledger。虽然当前权限模型仍是课程版单管理员模式，但已经体现了审计、复盘和治理的基本思路。</w:t>
+        <w:t>运维安全方面，后台使用管理员口令，运行记录持久化到 SQLite，异常可进入 case ledger。虽然当前权限模型仍为单管理员模式，但已经体现了审计、复盘和治理的基本思路。</w:t>
       </w:r>
     </w:p>
     <w:p>
@@ -6407,7 +6407,7 @@
           <w:rFonts w:ascii="Calibri" w:hAnsi="Calibri" w:eastAsia="Microsoft YaHei"/>
           <w:b w:val="0"/>
         </w:rPr>
-        <w:t>刷新项目验收报告：</w:t>
+        <w:t>刷新项目实验汇总报告：</w:t>
       </w:r>
     </w:p>
     <w:p>
@@ -6539,7 +6539,7 @@
           <w:rFonts w:ascii="Calibri" w:hAnsi="Calibri" w:eastAsia="Microsoft YaHei"/>
           <w:b w:val="0"/>
         </w:rPr>
-        <w:t>生成等待体验代理评分：</w:t>
+        <w:t>生成等待体验代理量化结果：</w:t>
       </w:r>
     </w:p>
     <w:p>
@@ -6648,7 +6648,7 @@
           <w:rFonts w:ascii="Calibri" w:hAnsi="Calibri" w:eastAsia="Microsoft YaHei"/>
           <w:b w:val="0"/>
         </w:rPr>
-        <w:t>最终提交前请把真实姓名和学号补入下表。当前分工按三人团队设计。</w:t>
+        <w:t>本项目按三人团队进行分工，具体姓名和学号由小组补充。</w:t>
       </w:r>
     </w:p>
     <w:tbl>
@@ -6829,7 +6829,7 @@
                 <w:b w:val="0"/>
                 <w:sz w:val="18"/>
               </w:rPr>
-              <w:t>负责需求拆解、FastAPI 服务、pipeline 主链路、provider 抽象、运行审计和最终提交整合。</w:t>
+              <w:t>负责需求拆解、FastAPI 服务、pipeline 主链路、provider 抽象、运行审计和项目整合。</w:t>
             </w:r>
           </w:p>
         </w:tc>
@@ -6968,7 +6968,7 @@
                 <w:b w:val="0"/>
                 <w:sz w:val="18"/>
               </w:rPr>
-              <w:t>前端与答辩材料</w:t>
+              <w:t>前端与文档材料</w:t>
             </w:r>
           </w:p>
         </w:tc>
@@ -6995,7 +6995,7 @@
                 <w:b w:val="0"/>
                 <w:sz w:val="18"/>
               </w:rPr>
-              <w:t>负责用户端界面、管理后台展示、答辩 PPT、演示脚本、运行手册和提交清单。</w:t>
+              <w:t>负责用户端界面、管理后台展示、运行手册和提交材料整理。</w:t>
             </w:r>
           </w:p>
         </w:tc>
@@ -7008,7 +7008,7 @@
           <w:rFonts w:ascii="Calibri" w:hAnsi="Calibri" w:eastAsia="Microsoft YaHei"/>
           <w:b w:val="0"/>
         </w:rPr>
-        <w:t>实际答辩时，可以按“系统目标 -&gt; 架构链路 -&gt; 安全增强 -&gt; 实验结果 -&gt; 演示 -&gt; 局限与展望”的顺序分配发言。</w:t>
+        <w:t>小组分工可根据实际贡献进一步细化。</w:t>
       </w:r>
     </w:p>
     <w:p>
@@ -7025,7 +7025,7 @@
           <w:rFonts w:ascii="Calibri" w:hAnsi="Calibri" w:eastAsia="Microsoft YaHei"/>
           <w:b w:val="0"/>
         </w:rPr>
-        <w:t>当前项目已经达到课程高分交付标准，但仍有几个需要如实说明的边界。第一，真实端到端语音链路已经从历史 3 条连通性验证扩展到 300 次重复实验，但仍然是课程规模的固定音频集评测，不等同于真实船厂长期生产压测。第二，浏览器首播平均约 4 秒，已经显著优于串行基线，但距离企业级语音助手“2 秒内自然接话”的体验仍有差距，后续需要更快的 TTS 后端、流式 TTS、缓存预热和更细粒度的音频分片。第三，主观等待体验当前采用自动化代理评分，不是真人 Likert 问卷；如果作为大创或比赛项目继续推进，应补充小规模真人听感评分。第四，当前知识库只有 20 条核心条目，适合课程演示和闭环验证，但距离真实船厂规程库还有差距。第五，当前数据库为 SQLite，后台认证为单管理员口令，企业级部署应迁移 PostgreSQL、RBAC、对象存储、异步队列和监控告警。第六，当前 real-only 策略要求答辩前必须准备好真实 provider；如果 GPU 或网络服务不可用，系统会失败并暴露错误，而不会生成替代结果。</w:t>
+        <w:t>当前系统仍有几个边界需要说明。第一，真实端到端语音链路已经从历史 3 条连通性验证扩展到 300 次重复实验，但仍然是固定音频集评测，不等同于真实船厂长期生产压测。第二，浏览器首播平均约 4 秒，已经显著优于串行基线，但距离企业级语音助手“2 秒内自然接话”的体验仍有差距，后续需要更快的 TTS 后端、流式 TTS、缓存预热和更细粒度的音频分片。第三，主观等待体验当前采用自动化代理量化等级，不是真人 Likert 问卷结果；后续可补充小规模真人听感问卷。第四，当前知识库只有 20 条核心条目，适合验证 RAG 引用和安全问答闭环，但距离真实船厂规程库还有差距。第五，当前数据库为 SQLite，后台认证为单管理员口令，企业级部署应迁移 PostgreSQL、RBAC、对象存储、异步队列和监控告警。第六，当前真实服务接入策略要求 ASR、LLM、TTS provider 保持可用；如果模型服务或网络不可用，系统会返回错误并记录日志。</w:t>
       </w:r>
     </w:p>
     <w:p>
@@ -7034,7 +7034,7 @@
           <w:rFonts w:ascii="Calibri" w:hAnsi="Calibri" w:eastAsia="Microsoft YaHei"/>
           <w:b w:val="0"/>
         </w:rPr>
-        <w:t>后续优化方向包括：扩展真实端到端评测到更多说话人、更多噪声和更长多轮任务；引入流式 TTS 或更快的中文语音合成模型；扩大知识库来源并加入来源可信度评分；将 LoRA 微调从当前在线模型验证推进到系统级 A/B 对比；补充 RBAC、审批流和企业部署文档；将管理后台评测结果做成趋势看板，支持版本回归对比。</w:t>
+        <w:t>后续优化方向包括：扩展真实端到端评测到更多说话人、更多噪声和更长多轮任务；引入流式 TTS 或更快的中文语音合成模型；扩大知识库来源并加入来源可信度评估；将 LoRA 微调从当前在线模型验证推进到系统级 A/B 对比；补充 RBAC、审批流和企业部署文档；将管理后台评测结果做成趋势看板，支持版本回归对比。</w:t>
       </w:r>
     </w:p>
     <w:p>
@@ -7051,7 +7051,7 @@
           <w:rFonts w:ascii="Calibri" w:hAnsi="Calibri" w:eastAsia="Microsoft YaHei"/>
           <w:b w:val="0"/>
         </w:rPr>
-        <w:t>ShipVoice 完成了课程 A2 要求的级联式造船语音问答系统，并在此基础上实现了安全门控、RAG 证据引用、术语后处理、多轮评测、真实 provider 接入、管理后台和运行审计。项目既有可运行系统，也有固定音频集、基线与流式改进对比、浏览器首播观测、等待体验量化和可复现文档。对于课堂评分，系统已经具备 95 分以上的核心证据；对于后续比赛和企业级方向，项目也留下了清晰的扩展路径。</w:t>
+        <w:t>ShipVoice 完成了课程 A2 要求的级联式造船语音问答系统，并在此基础上实现了安全门控、RAG 证据引用、术语后处理、多轮评测、真实 provider 接入、管理后台和运行审计。项目既有可运行系统，也有固定音频集、基线与流式改进对比、浏览器首播观测、等待体验量化和可复现文档。后续若继续推进，可围绕更大规模真实场景评测、完整船厂规程库、权限体系和部署监控能力继续扩展。</w:t>
       </w:r>
     </w:p>
     <w:p>
@@ -7060,7 +7060,7 @@
           <w:rFonts w:ascii="Calibri" w:hAnsi="Calibri" w:eastAsia="Microsoft YaHei"/>
           <w:b w:val="0"/>
         </w:rPr>
-        <w:t>本项目最重要的价值在于，它没有把语音问答停留在“能问能答”的表面，而是把船厂安全场景中的风险控制、证据可信、审计复盘和工程可维护性纳入了系统设计。这使 ShipVoice 更接近一个真实安全助手原型，而不是一次性的课程演示页面。</w:t>
+        <w:t>本项目最重要的价值在于，它没有把语音问答停留在“能问能答”的表面，而是把船厂安全场景中的风险控制、证据可信、审计复盘和工程可维护性纳入了系统设计。这使 ShipVoice 更接近一个真实安全助手原型，而不是一次性的展示页面。</w:t>
       </w:r>
     </w:p>
     <w:sectPr>
@@ -7088,7 +7088,7 @@
         <w:color w:val="5A5A5A"/>
         <w:sz w:val="18"/>
       </w:rPr>
-      <w:t>最终提交版 | 小组成员与学号请在提交前补齐</w:t>
+      <w:t>ShipVoice 船厂安全实时语音问答助手 | 信息安全基础 A2</w:t>
     </w:r>
   </w:p>
 </w:ftr>

</xml_diff>

<commit_message>
Harden ShipVoice RAG citation flow
</commit_message>
<xml_diff>
--- a/deliverables/final_submission/report/ShipVoice_船厂安全实时语音问答助手_项目报告_最终版.docx
+++ b/deliverables/final_submission/report/ShipVoice_船厂安全实时语音问答助手_项目报告_最终版.docx
@@ -927,6 +927,7 @@
     <w:p>
       <w:pPr>
         <w:spacing w:before="40" w:after="160" w:line="252" w:lineRule="auto"/>
+        <w:jc w:val="left"/>
         <w:shd w:fill="F2F4F7"/>
       </w:pPr>
       <w:r>
@@ -1036,7 +1037,7 @@
           <w:rFonts w:ascii="Calibri" w:hAnsi="Calibri" w:eastAsia="Microsoft YaHei"/>
           <w:b w:val="0"/>
         </w:rPr>
-        <w:t>1. Fail-closed 策略：ASR、LLM、TTS 任一真实服务不可用时，请求直接失败并写入审计日志，不返回虚假答案或虚假音频。</w:t>
+        <w:t>1. Fail-closed 策略：相应链路需要调用的 ASR、LLM、TTS 真实服务不可用时，请求直接失败并写入审计日志，不返回虚假答案或虚假音频。</w:t>
       </w:r>
     </w:p>
     <w:p>
@@ -2112,7 +2113,7 @@
           <w:rFonts w:ascii="Calibri" w:hAnsi="Calibri" w:eastAsia="Microsoft YaHei"/>
           <w:b w:val="0"/>
         </w:rPr>
-        <w:t>本章截图均取自本地实际运行实例（FastAPI 应用 + 管理后台 + Swagger 文档）。截图反映系统界面布局、知识治理能力与 API 结构；Provider Health 面板同时如实显示本地演示环境下 ASR、LLM、TTS 远端服务未启动时的 unreachable 状态，体现 real-only 策略下 fail-closed 的可观测性。</w:t>
+        <w:t>本章截图均取自本地实际运行实例（FastAPI 应用 + 管理后台 + Swagger 文档）。截图反映系统界面布局、知识治理能力与 API 结构；Provider Health 面板同时如实显示截图采集环境中 ASR、LLM、TTS 远端服务未启动时的 unreachable 状态，体现 real-only 策略下 fail-closed 的可观测性。</w:t>
       </w:r>
     </w:p>
     <w:p>
@@ -4159,7 +4160,7 @@
                 <w:b w:val="0"/>
                 <w:sz w:val="18"/>
               </w:rPr>
-              <w:t>准确率待批量刷新</w:t>
+              <w:t>评测文件决策准确率 100%，可由后台批量刷新</w:t>
             </w:r>
           </w:p>
         </w:tc>
@@ -4381,7 +4382,7 @@
                 <w:b w:val="0"/>
                 <w:sz w:val="18"/>
               </w:rPr>
-              <w:t>3 条样本</w:t>
+              <w:t>历史 smoke 3 条；主实验 300 次</w:t>
             </w:r>
           </w:p>
         </w:tc>
@@ -4408,7 +4409,7 @@
                 <w:b w:val="0"/>
                 <w:sz w:val="18"/>
               </w:rPr>
-              <w:t>ASR 158 ms，载荷就绪 15239 ms</w:t>
+              <w:t>后台可展示历史 smoke 记录，主证据见第 9 章重复实验</w:t>
             </w:r>
           </w:p>
         </w:tc>
@@ -4877,7 +4878,7 @@
                 <w:b w:val="0"/>
                 <w:sz w:val="18"/>
               </w:rPr>
-              <w:t>real_chain_samples</w:t>
+              <w:t>real_chain_smoke_samples</w:t>
             </w:r>
           </w:p>
         </w:tc>
@@ -5454,7 +5455,7 @@
           <w:rFonts w:ascii="Calibri" w:hAnsi="Calibri" w:eastAsia="Microsoft YaHei"/>
           <w:b w:val="0"/>
         </w:rPr>
-        <w:t>Provider Health 面板对 ASR、LLM、TTS 三个真实服务端点发起探测。本地演示环境下远端 GPU 服务未启动，三个 provider 均显示 unreachable（Connection refused），与 real-only 策略一致：服务不可用时前端请求失败，不在界面生成虚假结果。</w:t>
+        <w:t>Provider Health 面板对 ASR、LLM、TTS 三个真实服务端点发起探测。截图采集时远端 GPU 服务未启动，三个 provider 均显示 unreachable（Connection refused），与 real-only 策略一致：服务不可用时前端请求失败，不在界面生成虚假结果。</w:t>
       </w:r>
     </w:p>
     <w:p>
@@ -5874,7 +5875,7 @@
           <w:rFonts w:ascii="Calibri" w:hAnsi="Calibri" w:eastAsia="Microsoft YaHei"/>
           <w:b w:val="0"/>
         </w:rPr>
-        <w:t>运行复盘面板用于定位失败请求、误拦截与延迟异常，支持设置处置状态（待处理/调查中/已解决等）、严重级别、负责人与复核备注。本地演示阶段尚无运行记录，答辩前需先启动远端 GPU 服务并完成至少一次真实问答，以产生可复盘的 audit 数据。</w:t>
+        <w:t>运行复盘面板用于定位失败请求、误拦截与延迟异常，支持设置处置状态（待处理/调查中/已解决等）、严重级别、负责人与复核备注。截图采集时该面板尚无运行记录；正式复现或答辩前应先启动远端 GPU 服务并完成至少一次真实问答，以产生可复盘的 audit 数据。</w:t>
       </w:r>
     </w:p>
     <w:p>
@@ -6146,7 +6147,7 @@
                 <w:b w:val="0"/>
                 <w:sz w:val="18"/>
               </w:rPr>
-              <w:t>15 个 REST/WebSocket 接口，非静态页面</w:t>
+              <w:t>30 余个 REST/WebSocket 接口，非静态页面</w:t>
             </w:r>
           </w:p>
         </w:tc>
@@ -10047,6 +10048,7 @@
     <w:p>
       <w:pPr>
         <w:spacing w:before="40" w:after="160" w:line="252" w:lineRule="auto"/>
+        <w:jc w:val="left"/>
         <w:shd w:fill="F2F4F7"/>
       </w:pPr>
       <w:r>
@@ -10077,7 +10079,9 @@
         <w:t>SHIPVOICE_TTS_VOICE=zh-CN-XiaoxiaoNeural</w:t>
         <w:br/>
         <w:br/>
-        <w:t>SHIPVOICE_ADMIN_PASSWORD=shipvoice-admin</w:t>
+        <w:t>SHIPVOICE_ADMIN_PASSWORD=&lt;set-a-strong-admin-password&gt;</w:t>
+        <w:br/>
+        <w:t>SHIPVOICE_ADMIN_SESSION_SECRET=&lt;set-a-random-session-secret&gt;</w:t>
         <w:br/>
         <w:t>SHIPVOICE_APP_PORT=8026</w:t>
       </w:r>
@@ -10102,6 +10106,7 @@
     <w:p>
       <w:pPr>
         <w:spacing w:before="40" w:after="160" w:line="252" w:lineRule="auto"/>
+        <w:jc w:val="left"/>
         <w:shd w:fill="F2F4F7"/>
       </w:pPr>
       <w:r>
@@ -10153,6 +10158,7 @@
     <w:p>
       <w:pPr>
         <w:spacing w:before="40" w:after="160" w:line="252" w:lineRule="auto"/>
+        <w:jc w:val="left"/>
         <w:shd w:fill="F2F4F7"/>
       </w:pPr>
       <w:r>
@@ -11721,6 +11727,7 @@
     <w:p>
       <w:pPr>
         <w:spacing w:before="40" w:after="160" w:line="252" w:lineRule="auto"/>
+        <w:jc w:val="left"/>
         <w:shd w:fill="F2F4F7"/>
       </w:pPr>
       <w:r>
@@ -11728,7 +11735,7 @@
           <w:rFonts w:ascii="Consolas" w:hAnsi="Consolas" w:eastAsia="Microsoft YaHei"/>
           <w:sz w:val="18"/>
         </w:rPr>
-        <w:t>输入 → ASR → [无术语纠错] → [无安全门控] → [无 RAG] → LLM 完整生成 → TTS 完整合成 → 一次返回播放</w:t>
+        <w:t>输入 → ASR → 术语后处理 → 安全门控 → LLM 完整生成 → TTS 完整合成 → 一次返回播放</w:t>
       </w:r>
     </w:p>
     <w:p>
@@ -11737,7 +11744,7 @@
           <w:rFonts w:ascii="Calibri" w:hAnsi="Calibri" w:eastAsia="Microsoft YaHei"/>
           <w:b w:val="0"/>
         </w:rPr>
-        <w:t>实现上，baseline 模式对应 pipeline 的 response_mode=baseline：等待 LLM 输出完整文本后，再调用 TTS 合成完整音频并一次性返回。该基线可完成基本问答，但存在以下局限：（1）ASR 误听直接传递至 LLM，导致检索与回答偏移；（2）LLM 可能对越界或危险请求继续生成；（3）回答缺乏来源依据，难以审计；（4）首段可播放延迟较高，用户等待体验不佳。</w:t>
+        <w:t>实现上，baseline 模式对应 pipeline 的 response_mode=baseline：保留 ASR、术语后处理与安全门控等必要安全前置，但等待 LLM 输出完整文本后，再调用 TTS 合成完整音频并一次性返回。该基线可完成基本问答与安全拦截，但存在以下局限：（1）不启用 RAG 证据引用时，回答依据不够透明；（2）等待完整回答与完整音频后才播放，首段可播放延迟较高；（3）无法体现分段 TTS 与浏览器音频队列对用户等待体验的改善。</w:t>
       </w:r>
     </w:p>
     <w:p>
@@ -11754,7 +11761,7 @@
           <w:rFonts w:ascii="Calibri" w:hAnsi="Calibri" w:eastAsia="Microsoft YaHei"/>
           <w:b w:val="0"/>
         </w:rPr>
-        <w:t>改进版在基线基础上集成以下模块：</w:t>
+        <w:t>ShipVoice 完整改进能力由以下模块构成。需要说明的是，第 9.6 节的 baseline/streaming 延迟实验主要比较响应时序，安全门控和术语后处理作为统一安全前置在公开运行模式中保持开启。</w:t>
       </w:r>
     </w:p>
     <w:tbl>
@@ -12857,7 +12864,7 @@
                 <w:b w:val="0"/>
                 <w:sz w:val="18"/>
               </w:rPr>
-              <w:t>演示结果不可信</w:t>
+              <w:t>结果真实性难验证</w:t>
             </w:r>
           </w:p>
         </w:tc>
@@ -13160,7 +13167,7 @@
                 <w:b w:val="0"/>
                 <w:sz w:val="18"/>
               </w:rPr>
-              <w:t>可能继续生成</w:t>
+              <w:t>公开运行模式均保留门控拦截</w:t>
             </w:r>
           </w:p>
         </w:tc>
@@ -13326,7 +13333,7 @@
                 <w:b w:val="0"/>
                 <w:sz w:val="18"/>
               </w:rPr>
-              <w:t>在线转写</w:t>
+              <w:t>在线转写可能产生术语误写</w:t>
             </w:r>
           </w:p>
         </w:tc>
@@ -13353,7 +13360,7 @@
                 <w:b w:val="0"/>
                 <w:sz w:val="18"/>
               </w:rPr>
-              <w:t>CER/WER 1.58%，术语召回 85.71%</w:t>
+              <w:t>在线评测 CER/WER 1.58%，术语召回 85.71%；已覆盖误写可规则化修正</w:t>
             </w:r>
           </w:p>
         </w:tc>
@@ -13658,7 +13665,7 @@
                 <w:b w:val="0"/>
                 <w:sz w:val="18"/>
               </w:rPr>
-              <w:t>可能 mock</w:t>
+              <w:t>结果来源不透明</w:t>
             </w:r>
           </w:p>
         </w:tc>
@@ -15489,7 +15496,7 @@
                 <w:b/>
                 <w:sz w:val="19"/>
               </w:rPr>
-              <w:t>Raw ASR</w:t>
+              <w:t>在线 ASR（无参考提示）</w:t>
             </w:r>
           </w:p>
         </w:tc>
@@ -15517,7 +15524,7 @@
                 <w:b/>
                 <w:sz w:val="19"/>
               </w:rPr>
-              <w:t>后处理后</w:t>
+              <w:t>本地清单修正列（覆盖样例复算）</w:t>
             </w:r>
           </w:p>
         </w:tc>
@@ -16028,7 +16035,7 @@
           <w:rFonts w:ascii="Calibri" w:hAnsi="Calibri" w:eastAsia="Microsoft YaHei"/>
           <w:b w:val="0"/>
         </w:rPr>
-        <w:t>典型纠错：西装阶段→舾装阶段，压在水仓→压载水舱，测氧测报→测氧测爆，冻火作业→动火作业。</w:t>
+        <w:t>典型纠错：西装阶段→舾装阶段，压在水仓→压载水舱，测氧测报→测氧测爆，冻火作业→动火作业。表中 0.00% 为固定清单中已覆盖误写的本地修正列复算结果，不代表在线 ASR 在开放场景下已达到零错误。</w:t>
       </w:r>
     </w:p>
     <w:p>
@@ -17271,7 +17278,7 @@
           <w:rFonts w:ascii="Calibri" w:hAnsi="Calibri" w:eastAsia="Microsoft YaHei"/>
           <w:b w:val="0"/>
         </w:rPr>
-        <w:t>实验设置：30 条固定录音（A001–A030），baseline 与 streaming 各重复 5 次，共 300 次 real-only 运行；ASR 为 SenseVoiceSmall，LLM 为 ShipVoice LoRA，TTS 为 Edge-TTS；num_ok=300，num_failed=0。</w:t>
+        <w:t>实验设置：30 条固定录音（A001–A030），baseline 与 streaming 各重复 5 次，共 300 次 real-only 运行；ASR 为 SenseVoiceSmall，LLM 为 ShipVoice LoRA，TTS 为 Edge-TTS；num_ok=300，num_failed=0。为保证安全边界一致，两种模式均保留术语后处理与安全门控，差异主要集中在“完整音频一次返回”与“安全闭合句段分段 TTS 首段优先播放”的时序机制。</w:t>
       </w:r>
     </w:p>
     <w:p>
@@ -21144,6 +21151,7 @@
     <w:p>
       <w:pPr>
         <w:spacing w:before="40" w:after="160" w:line="252" w:lineRule="auto"/>
+        <w:jc w:val="left"/>
         <w:shd w:fill="F2F4F7"/>
       </w:pPr>
       <w:r>
@@ -21151,11 +21159,11 @@
           <w:rFonts w:ascii="Consolas" w:hAnsi="Consolas" w:eastAsia="Microsoft YaHei"/>
           <w:sz w:val="18"/>
         </w:rPr>
-        <w:t>cd ShipVoice</w:t>
-        <w:br/>
         <w:t>python -m pip install -r requirements.txt</w:t>
         <w:br/>
-        <w:t>$env:SHIPVOICE_ADMIN_PASSWORD="shipvoice-admin"</w:t>
+        <w:t>$env:SHIPVOICE_ADMIN_PASSWORD="your-password"</w:t>
+        <w:br/>
+        <w:t>$env:SHIPVOICE_ADMIN_SESSION_SECRET="your-random-session-secret"</w:t>
         <w:br/>
         <w:t>python run_app.py --port 8026</w:t>
       </w:r>
@@ -21172,6 +21180,7 @@
     <w:p>
       <w:pPr>
         <w:spacing w:before="40" w:after="160" w:line="252" w:lineRule="auto"/>
+        <w:jc w:val="left"/>
         <w:shd w:fill="F2F4F7"/>
       </w:pPr>
       <w:r>
@@ -21194,6 +21203,7 @@
     <w:p>
       <w:pPr>
         <w:spacing w:before="40" w:after="160" w:line="252" w:lineRule="auto"/>
+        <w:jc w:val="left"/>
         <w:shd w:fill="F2F4F7"/>
       </w:pPr>
       <w:r>
@@ -21210,12 +21220,27 @@
           <w:rFonts w:ascii="Calibri" w:hAnsi="Calibri" w:eastAsia="Microsoft YaHei"/>
           <w:b w:val="0"/>
         </w:rPr>
-        <w:t>默认后台密码为：</w:t>
+        <w:t xml:space="preserve">后台密码为启动前设置的 </w:t>
+      </w:r>
+      <w:r>
+        <w:rPr>
+          <w:rFonts w:ascii="Consolas" w:hAnsi="Consolas" w:eastAsia="Microsoft YaHei"/>
+          <w:sz w:val="19"/>
+        </w:rPr>
+        <w:t>SHIPVOICE_ADMIN_PASSWORD</w:t>
+      </w:r>
+      <w:r>
+        <w:rPr>
+          <w:rFonts w:ascii="Calibri" w:hAnsi="Calibri" w:eastAsia="Microsoft YaHei"/>
+          <w:b w:val="0"/>
+        </w:rPr>
+        <w:t>。未设置该变量时，后台登录默认关闭；课程本地演示可临时设置自己的口令，公开提交材料中不应写入真实密码：</w:t>
       </w:r>
     </w:p>
     <w:p>
       <w:pPr>
         <w:spacing w:before="40" w:after="160" w:line="252" w:lineRule="auto"/>
+        <w:jc w:val="left"/>
         <w:shd w:fill="F2F4F7"/>
       </w:pPr>
       <w:r>
@@ -21223,7 +21248,7 @@
           <w:rFonts w:ascii="Consolas" w:hAnsi="Consolas" w:eastAsia="Microsoft YaHei"/>
           <w:sz w:val="18"/>
         </w:rPr>
-        <w:t>shipvoice-admin</w:t>
+        <w:t>your-password</w:t>
       </w:r>
     </w:p>
     <w:p>
@@ -21238,6 +21263,7 @@
     <w:p>
       <w:pPr>
         <w:spacing w:before="40" w:after="160" w:line="252" w:lineRule="auto"/>
+        <w:jc w:val="left"/>
         <w:shd w:fill="F2F4F7"/>
       </w:pPr>
       <w:r>
@@ -21245,7 +21271,16 @@
           <w:rFonts w:ascii="Consolas" w:hAnsi="Consolas" w:eastAsia="Microsoft YaHei"/>
           <w:sz w:val="18"/>
         </w:rPr>
-        <w:t>python -m pytest tests -q</w:t>
+        <w:t>python -m unittest discover -s tests -v</w:t>
+      </w:r>
+    </w:p>
+    <w:p>
+      <w:r>
+        <w:rPr>
+          <w:rFonts w:ascii="Calibri" w:hAnsi="Calibri" w:eastAsia="Microsoft YaHei"/>
+          <w:b w:val="0"/>
+        </w:rPr>
+        <w:t>当前仓库在本次报告校对时该命令通过，结果为 48 tests OK。</w:t>
       </w:r>
     </w:p>
     <w:p>
@@ -21260,6 +21295,7 @@
     <w:p>
       <w:pPr>
         <w:spacing w:before="40" w:after="160" w:line="252" w:lineRule="auto"/>
+        <w:jc w:val="left"/>
         <w:shd w:fill="F2F4F7"/>
       </w:pPr>
       <w:r>
@@ -21282,6 +21318,7 @@
     <w:p>
       <w:pPr>
         <w:spacing w:before="40" w:after="160" w:line="252" w:lineRule="auto"/>
+        <w:jc w:val="left"/>
         <w:shd w:fill="F2F4F7"/>
       </w:pPr>
       <w:r>
@@ -21289,7 +21326,7 @@
           <w:rFonts w:ascii="Consolas" w:hAnsi="Consolas" w:eastAsia="Microsoft YaHei"/>
           <w:sz w:val="18"/>
         </w:rPr>
-        <w:t>python scripts\evaluate_safety_gate.py --gate-only</w:t>
+        <w:t>python scripts\evaluate_safety_gate.py --gate-only --fail-on-critical</w:t>
       </w:r>
     </w:p>
     <w:p>
@@ -21304,6 +21341,7 @@
     <w:p>
       <w:pPr>
         <w:spacing w:before="40" w:after="160" w:line="252" w:lineRule="auto"/>
+        <w:jc w:val="left"/>
         <w:shd w:fill="F2F4F7"/>
       </w:pPr>
       <w:r>
@@ -21320,12 +21358,13 @@
           <w:rFonts w:ascii="Calibri" w:hAnsi="Calibri" w:eastAsia="Microsoft YaHei"/>
           <w:b w:val="0"/>
         </w:rPr>
-        <w:t>运行 ASR 清单评测：</w:t>
+        <w:t>运行本地 ASR 清单统计（使用已有转写列）：</w:t>
       </w:r>
     </w:p>
     <w:p>
       <w:pPr>
         <w:spacing w:before="40" w:after="160" w:line="252" w:lineRule="auto"/>
+        <w:jc w:val="left"/>
         <w:shd w:fill="F2F4F7"/>
       </w:pPr>
       <w:r>
@@ -21333,7 +21372,7 @@
           <w:rFonts w:ascii="Consolas" w:hAnsi="Consolas" w:eastAsia="Microsoft YaHei"/>
           <w:sz w:val="18"/>
         </w:rPr>
-        <w:t>python scripts\evaluate_asr_transcripts.py</w:t>
+        <w:t>python scripts\evaluate_asr_transcripts.py --hypothesis-column asr_transcript</w:t>
       </w:r>
     </w:p>
     <w:p>
@@ -21348,6 +21387,7 @@
     <w:p>
       <w:pPr>
         <w:spacing w:before="40" w:after="160" w:line="252" w:lineRule="auto"/>
+        <w:jc w:val="left"/>
         <w:shd w:fill="F2F4F7"/>
       </w:pPr>
       <w:r>
@@ -21370,6 +21410,7 @@
     <w:p>
       <w:pPr>
         <w:spacing w:before="40" w:after="160" w:line="252" w:lineRule="auto"/>
+        <w:jc w:val="left"/>
         <w:shd w:fill="F2F4F7"/>
       </w:pPr>
       <w:r>
@@ -21392,6 +21433,7 @@
     <w:p>
       <w:pPr>
         <w:spacing w:before="40" w:after="160" w:line="252" w:lineRule="auto"/>
+        <w:jc w:val="left"/>
         <w:shd w:fill="F2F4F7"/>
       </w:pPr>
       <w:r>
@@ -21428,6 +21470,7 @@
     <w:p>
       <w:pPr>
         <w:spacing w:before="40" w:after="160" w:line="252" w:lineRule="auto"/>
+        <w:jc w:val="left"/>
         <w:shd w:fill="F2F4F7"/>
       </w:pPr>
       <w:r>
@@ -21444,12 +21487,81 @@
           <w:rFonts w:ascii="Calibri" w:hAnsi="Calibri" w:eastAsia="Microsoft YaHei"/>
           <w:b w:val="0"/>
         </w:rPr>
+        <w:t>接入真实 ASR 后，可运行在线 ASR 评测：</w:t>
+      </w:r>
+    </w:p>
+    <w:p>
+      <w:pPr>
+        <w:spacing w:before="40" w:after="160" w:line="252" w:lineRule="auto"/>
+        <w:jc w:val="left"/>
+        <w:shd w:fill="F2F4F7"/>
+      </w:pPr>
+      <w:r>
+        <w:rPr>
+          <w:rFonts w:ascii="Consolas" w:hAnsi="Consolas" w:eastAsia="Microsoft YaHei"/>
+          <w:sz w:val="18"/>
+        </w:rPr>
+        <w:t>python scripts\evaluate_asr_online.py `</w:t>
+        <w:br/>
+        <w:t xml:space="preserve">  --env-file configs\runtime.real.env `</w:t>
+        <w:br/>
+        <w:t xml:space="preserve">  --output-dir results\asr_online_YYYYMMDD `</w:t>
+        <w:br/>
+        <w:t xml:space="preserve">  --fail-fast</w:t>
+      </w:r>
+    </w:p>
+    <w:p>
+      <w:r>
+        <w:rPr>
+          <w:rFonts w:ascii="Calibri" w:hAnsi="Calibri" w:eastAsia="Microsoft YaHei"/>
+          <w:b w:val="0"/>
+        </w:rPr>
+        <w:t>复现第 9 章 300 次真实链路重复实验：</w:t>
+      </w:r>
+    </w:p>
+    <w:p>
+      <w:pPr>
+        <w:spacing w:before="40" w:after="160" w:line="252" w:lineRule="auto"/>
+        <w:jc w:val="left"/>
+        <w:shd w:fill="F2F4F7"/>
+      </w:pPr>
+      <w:r>
+        <w:rPr>
+          <w:rFonts w:ascii="Consolas" w:hAnsi="Consolas" w:eastAsia="Microsoft YaHei"/>
+          <w:sz w:val="18"/>
+        </w:rPr>
+        <w:t>python scripts\run_real_chain_repeated.py `</w:t>
+        <w:br/>
+        <w:t xml:space="preserve">  --env-file configs\runtime.real.env `</w:t>
+        <w:br/>
+        <w:t xml:space="preserve">  --modes baseline,streaming `</w:t>
+        <w:br/>
+        <w:t xml:space="preserve">  --limit 30 `</w:t>
+        <w:br/>
+        <w:t xml:space="preserve">  --repeats 5 `</w:t>
+        <w:br/>
+        <w:t xml:space="preserve">  --shuffle `</w:t>
+        <w:br/>
+        <w:t xml:space="preserve">  --seed 20260623 `</w:t>
+        <w:br/>
+        <w:t xml:space="preserve">  --require-lora `</w:t>
+        <w:br/>
+        <w:t xml:space="preserve">  --require-llm-model-substring shipvoice</w:t>
+      </w:r>
+    </w:p>
+    <w:p>
+      <w:r>
+        <w:rPr>
+          <w:rFonts w:ascii="Calibri" w:hAnsi="Calibri" w:eastAsia="Microsoft YaHei"/>
+          <w:b w:val="0"/>
+        </w:rPr>
         <w:t>真实链路验证与第 9 章主证据应以以下文件为准：</w:t>
       </w:r>
     </w:p>
     <w:p>
       <w:pPr>
         <w:spacing w:before="40" w:after="160" w:line="252" w:lineRule="auto"/>
+        <w:jc w:val="left"/>
         <w:shd w:fill="F2F4F7"/>
       </w:pPr>
       <w:r>
@@ -21543,7 +21655,7 @@
           <w:rFonts w:ascii="Calibri" w:hAnsi="Calibri" w:eastAsia="Microsoft YaHei"/>
           <w:b w:val="0"/>
         </w:rPr>
-        <w:t>（1）ASR 术语后处理：术语召回由 85.71% 提升至 100%，降低级联误差。</w:t>
+        <w:t>（1）ASR 术语后处理：在线 ASR 主评测术语召回为 85.71%；对固定清单中已覆盖的典型误写，规则修正列可将术语命中由 24/28 修正至 28/28，降低级联误差。</w:t>
       </w:r>
     </w:p>
     <w:p>
@@ -21605,7 +21717,7 @@
           <w:rFonts w:ascii="Calibri" w:hAnsi="Calibri" w:eastAsia="Microsoft YaHei"/>
           <w:b w:val="0"/>
         </w:rPr>
-        <w:t>（2）Fail-closed：真实服务缺失时直接失败，不返回 mock 结果。</w:t>
+        <w:t>（2）Fail-closed：真实服务缺失时直接失败，不返回替代结果。</w:t>
       </w:r>
     </w:p>
     <w:p>
@@ -21742,7 +21854,7 @@
           <w:rFonts w:ascii="Calibri" w:hAnsi="Calibri" w:eastAsia="Microsoft YaHei"/>
           <w:b w:val="0"/>
         </w:rPr>
-        <w:t>real-only 策略要求 ASR、LLM、TTS 持续在线。答辩现场若 GPU 或网络不稳定，应展示已归档的真实链路 JSON 证据，而非离线 mock。</w:t>
+        <w:t>real-only 策略要求 ASR、LLM、TTS 持续在线。答辩现场若 GPU 或网络不稳定，应展示已归档的真实链路 JSON 证据，而非离线替代结果。</w:t>
       </w:r>
     </w:p>
     <w:p>

</xml_diff>